<commit_message>
Justificación de negocio completo
</commit_message>
<xml_diff>
--- a/API de planes de ahorro bancario.docx
+++ b/API de planes de ahorro bancario.docx
@@ -1978,13 +1978,7 @@
               <w:rPr>
                 <w:rFonts w:ascii="Times New Roman" w:hAnsi="Times New Roman" w:cs="Times New Roman"/>
               </w:rPr>
-              <w:t>Porcentaje de cuotas canceladas después de cinco intentos fallidos por falta de fondo</w:t>
-            </w:r>
-            <w:r>
-              <w:rPr>
-                <w:rFonts w:ascii="Times New Roman" w:hAnsi="Times New Roman" w:cs="Times New Roman"/>
-              </w:rPr>
-              <w:t>s.</w:t>
+              <w:t>Porcentaje de cuotas canceladas después de cinco intentos fallidos por falta de fondos.</w:t>
             </w:r>
           </w:p>
         </w:tc>
@@ -2314,6 +2308,7 @@
           </w:tcPr>
           <w:p>
             <w:pPr>
+              <w:keepNext/>
               <w:jc w:val="both"/>
               <w:rPr>
                 <w:rFonts w:ascii="Times New Roman" w:hAnsi="Times New Roman" w:cs="Times New Roman"/>
@@ -2329,6 +2324,67 @@
         </w:tc>
       </w:tr>
     </w:tbl>
+    <w:p>
+      <w:pPr>
+        <w:pStyle w:val="Descripcin"/>
+        <w:jc w:val="center"/>
+        <w:rPr>
+          <w:rFonts w:ascii="Times New Roman" w:hAnsi="Times New Roman" w:cs="Times New Roman"/>
+          <w:color w:val="auto"/>
+        </w:rPr>
+      </w:pPr>
+      <w:r>
+        <w:rPr>
+          <w:rFonts w:ascii="Times New Roman" w:hAnsi="Times New Roman" w:cs="Times New Roman"/>
+          <w:color w:val="auto"/>
+        </w:rPr>
+        <w:lastRenderedPageBreak/>
+        <w:t xml:space="preserve">Tabla </w:t>
+      </w:r>
+      <w:r>
+        <w:rPr>
+          <w:rFonts w:ascii="Times New Roman" w:hAnsi="Times New Roman" w:cs="Times New Roman"/>
+          <w:color w:val="auto"/>
+        </w:rPr>
+        <w:fldChar w:fldCharType="begin"/>
+      </w:r>
+      <w:r>
+        <w:rPr>
+          <w:rFonts w:ascii="Times New Roman" w:hAnsi="Times New Roman" w:cs="Times New Roman"/>
+          <w:color w:val="auto"/>
+        </w:rPr>
+        <w:instrText xml:space="preserve"> SEQ Tabla \* ARABIC </w:instrText>
+      </w:r>
+      <w:r>
+        <w:rPr>
+          <w:rFonts w:ascii="Times New Roman" w:hAnsi="Times New Roman" w:cs="Times New Roman"/>
+          <w:color w:val="auto"/>
+        </w:rPr>
+        <w:fldChar w:fldCharType="separate"/>
+      </w:r>
+      <w:r>
+        <w:rPr>
+          <w:rFonts w:ascii="Times New Roman" w:hAnsi="Times New Roman" w:cs="Times New Roman"/>
+          <w:noProof/>
+          <w:color w:val="auto"/>
+        </w:rPr>
+        <w:t>1</w:t>
+      </w:r>
+      <w:r>
+        <w:rPr>
+          <w:rFonts w:ascii="Times New Roman" w:hAnsi="Times New Roman" w:cs="Times New Roman"/>
+          <w:color w:val="auto"/>
+        </w:rPr>
+        <w:fldChar w:fldCharType="end"/>
+      </w:r>
+      <w:r>
+        <w:rPr>
+          <w:rFonts w:ascii="Times New Roman" w:hAnsi="Times New Roman" w:cs="Times New Roman"/>
+          <w:color w:val="auto"/>
+        </w:rPr>
+        <w:t>. Indicadores de éxito del sistema</w:t>
+      </w:r>
+    </w:p>
     <w:p>
       <w:pPr>
         <w:pStyle w:val="Ttulo2"/>
@@ -2350,7 +2406,6 @@
           <w:sz w:val="28"/>
           <w:szCs w:val="28"/>
         </w:rPr>
-        <w:lastRenderedPageBreak/>
         <w:t>4. Cadena de valor de la API</w:t>
       </w:r>
     </w:p>
@@ -2716,13 +2771,7 @@
               <w:rPr>
                 <w:rFonts w:ascii="Times New Roman" w:hAnsi="Times New Roman" w:cs="Times New Roman"/>
               </w:rPr>
-              <w:t>Proporciona las cuentas, ejecuta los débitos y confirma el resultado de las operaciones</w:t>
-            </w:r>
-            <w:r>
-              <w:rPr>
-                <w:rFonts w:ascii="Times New Roman" w:hAnsi="Times New Roman" w:cs="Times New Roman"/>
-              </w:rPr>
-              <w:t>.</w:t>
+              <w:t>Proporciona las cuentas, ejecuta los débitos y confirma el resultado de las operaciones.</w:t>
             </w:r>
           </w:p>
         </w:tc>
@@ -2873,6 +2922,7 @@
           </w:tcPr>
           <w:p>
             <w:pPr>
+              <w:keepNext/>
               <w:jc w:val="both"/>
               <w:rPr>
                 <w:rFonts w:ascii="Times New Roman" w:hAnsi="Times New Roman" w:cs="Times New Roman"/>
@@ -2890,11 +2940,63 @@
     </w:tbl>
     <w:p>
       <w:pPr>
-        <w:jc w:val="both"/>
-        <w:rPr>
-          <w:rFonts w:ascii="Times New Roman" w:hAnsi="Times New Roman" w:cs="Times New Roman"/>
-        </w:rPr>
-      </w:pPr>
+        <w:pStyle w:val="Descripcin"/>
+        <w:jc w:val="center"/>
+        <w:rPr>
+          <w:rFonts w:ascii="Times New Roman" w:hAnsi="Times New Roman" w:cs="Times New Roman"/>
+          <w:color w:val="auto"/>
+        </w:rPr>
+      </w:pPr>
+      <w:r>
+        <w:rPr>
+          <w:rFonts w:ascii="Times New Roman" w:hAnsi="Times New Roman" w:cs="Times New Roman"/>
+          <w:color w:val="auto"/>
+        </w:rPr>
+        <w:t xml:space="preserve">Tabla </w:t>
+      </w:r>
+      <w:r>
+        <w:rPr>
+          <w:rFonts w:ascii="Times New Roman" w:hAnsi="Times New Roman" w:cs="Times New Roman"/>
+          <w:color w:val="auto"/>
+        </w:rPr>
+        <w:fldChar w:fldCharType="begin"/>
+      </w:r>
+      <w:r>
+        <w:rPr>
+          <w:rFonts w:ascii="Times New Roman" w:hAnsi="Times New Roman" w:cs="Times New Roman"/>
+          <w:color w:val="auto"/>
+        </w:rPr>
+        <w:instrText xml:space="preserve"> SEQ Tabla \* ARABIC </w:instrText>
+      </w:r>
+      <w:r>
+        <w:rPr>
+          <w:rFonts w:ascii="Times New Roman" w:hAnsi="Times New Roman" w:cs="Times New Roman"/>
+          <w:color w:val="auto"/>
+        </w:rPr>
+        <w:fldChar w:fldCharType="separate"/>
+      </w:r>
+      <w:r>
+        <w:rPr>
+          <w:rFonts w:ascii="Times New Roman" w:hAnsi="Times New Roman" w:cs="Times New Roman"/>
+          <w:noProof/>
+          <w:color w:val="auto"/>
+        </w:rPr>
+        <w:t>2</w:t>
+      </w:r>
+      <w:r>
+        <w:rPr>
+          <w:rFonts w:ascii="Times New Roman" w:hAnsi="Times New Roman" w:cs="Times New Roman"/>
+          <w:color w:val="auto"/>
+        </w:rPr>
+        <w:fldChar w:fldCharType="end"/>
+      </w:r>
+      <w:r>
+        <w:rPr>
+          <w:rFonts w:ascii="Times New Roman" w:hAnsi="Times New Roman" w:cs="Times New Roman"/>
+          <w:color w:val="auto"/>
+        </w:rPr>
+        <w:t>. Participantes del sistema</w:t>
+      </w:r>
     </w:p>
     <w:p>
       <w:pPr>
@@ -2932,19 +3034,7 @@
         <w:rPr>
           <w:rFonts w:ascii="Times New Roman" w:hAnsi="Times New Roman" w:cs="Times New Roman"/>
         </w:rPr>
-        <w:t>La cadena comienza con una simulación pública y anónima. El usuario establece las condiciones del ahorro y consulta el monto acumulado y los intereses proyectados antes de asumir un compromiso.</w:t>
-      </w:r>
-      <w:r>
-        <w:rPr>
-          <w:rFonts w:ascii="Times New Roman" w:hAnsi="Times New Roman" w:cs="Times New Roman"/>
-        </w:rPr>
-        <w:t xml:space="preserve"> </w:t>
-      </w:r>
-      <w:r>
-        <w:rPr>
-          <w:rFonts w:ascii="Times New Roman" w:hAnsi="Times New Roman" w:cs="Times New Roman"/>
-        </w:rPr>
-        <w:t>Si decide continuar, se autentica en la aplicación bancaria y crea el plan. Durante este proceso define el nombre, el monto objetivo, el plazo, la cuota fija mensual, la fecha del débito y la modalidad de ahorro. El plan puede mantenerse disponible o bloquearse a plazo para obtener una mejor tasa.</w:t>
+        <w:t>La cadena comienza con una simulación pública y anónima. El usuario establece las condiciones del ahorro y consulta el monto acumulado y los intereses proyectados antes de asumir un compromiso. Si decide continuar, se autentica en la aplicación bancaria y crea el plan. Durante este proceso define el nombre, el monto objetivo, el plazo, la cuota fija mensual, la fecha del débito y la modalidad de ahorro. El plan puede mantenerse disponible o bloquearse a plazo para obtener una mejor tasa.</w:t>
       </w:r>
     </w:p>
     <w:p>
@@ -2984,26 +3074,8 @@
         <w:rPr>
           <w:rFonts w:ascii="Times New Roman" w:hAnsi="Times New Roman" w:cs="Times New Roman"/>
         </w:rPr>
-        <w:t xml:space="preserve">Durante la vigencia del plan, el cliente consulta los movimientos, la barra de progreso y el porcentaje de cumplimiento. El historial inmutable permite reconstruir el saldo, </w:t>
-      </w:r>
-      <w:r>
-        <w:rPr>
-          <w:rFonts w:ascii="Times New Roman" w:hAnsi="Times New Roman" w:cs="Times New Roman"/>
-        </w:rPr>
         <w:lastRenderedPageBreak/>
-        <w:t>mientras que las notificaciones informan los resultados de los débitos y los cambios del plan.</w:t>
-      </w:r>
-      <w:r>
-        <w:rPr>
-          <w:rFonts w:ascii="Times New Roman" w:hAnsi="Times New Roman" w:cs="Times New Roman"/>
-        </w:rPr>
-        <w:t xml:space="preserve"> </w:t>
-      </w:r>
-      <w:r>
-        <w:rPr>
-          <w:rFonts w:ascii="Times New Roman" w:hAnsi="Times New Roman" w:cs="Times New Roman"/>
-        </w:rPr>
-        <w:t>El proceso concluye cuando el saldo alcanza el monto objetivo y los fondos se liquidan al cliente. También puede finalizar por cancelación anticipada, caso en el que los fondos regresan a la cuenta principal. Si el plan se encontraba bloqueado, se pierden los intereses devengados.</w:t>
+        <w:t>Durante la vigencia del plan, el cliente consulta los movimientos, la barra de progreso y el porcentaje de cumplimiento. El historial inmutable permite reconstruir el saldo, mientras que las notificaciones informan los resultados de los débitos y los cambios del plan. El proceso concluye cuando el saldo alcanza el monto objetivo y los fondos se liquidan al cliente. También puede finalizar por cancelación anticipada, caso en el que los fondos regresan a la cuenta principal. Si el plan se encontraba bloqueado, se pierden los intereses devengados.</w:t>
       </w:r>
     </w:p>
     <w:p>
@@ -3572,6 +3644,7 @@
           </w:tcPr>
           <w:p>
             <w:pPr>
+              <w:keepNext/>
               <w:spacing w:after="160" w:line="278" w:lineRule="auto"/>
               <w:rPr>
                 <w:rFonts w:ascii="Times New Roman" w:hAnsi="Times New Roman" w:cs="Times New Roman"/>
@@ -3589,13 +3662,73 @@
     </w:tbl>
     <w:p>
       <w:pPr>
-        <w:tabs>
-          <w:tab w:val="left" w:pos="1206"/>
-        </w:tabs>
-        <w:rPr>
-          <w:rFonts w:ascii="Times New Roman" w:hAnsi="Times New Roman" w:cs="Times New Roman"/>
-        </w:rPr>
-      </w:pPr>
+        <w:pStyle w:val="Descripcin"/>
+        <w:jc w:val="center"/>
+        <w:rPr>
+          <w:rFonts w:ascii="Times New Roman" w:hAnsi="Times New Roman" w:cs="Times New Roman"/>
+          <w:color w:val="auto"/>
+        </w:rPr>
+      </w:pPr>
+      <w:r>
+        <w:rPr>
+          <w:rFonts w:ascii="Times New Roman" w:hAnsi="Times New Roman" w:cs="Times New Roman"/>
+          <w:color w:val="auto"/>
+        </w:rPr>
+        <w:t xml:space="preserve">Tabla </w:t>
+      </w:r>
+      <w:r>
+        <w:rPr>
+          <w:rFonts w:ascii="Times New Roman" w:hAnsi="Times New Roman" w:cs="Times New Roman"/>
+          <w:color w:val="auto"/>
+        </w:rPr>
+        <w:fldChar w:fldCharType="begin"/>
+      </w:r>
+      <w:r>
+        <w:rPr>
+          <w:rFonts w:ascii="Times New Roman" w:hAnsi="Times New Roman" w:cs="Times New Roman"/>
+          <w:color w:val="auto"/>
+        </w:rPr>
+        <w:instrText xml:space="preserve"> SEQ Tabla \* ARABIC </w:instrText>
+      </w:r>
+      <w:r>
+        <w:rPr>
+          <w:rFonts w:ascii="Times New Roman" w:hAnsi="Times New Roman" w:cs="Times New Roman"/>
+          <w:color w:val="auto"/>
+        </w:rPr>
+        <w:fldChar w:fldCharType="separate"/>
+      </w:r>
+      <w:r>
+        <w:rPr>
+          <w:rFonts w:ascii="Times New Roman" w:hAnsi="Times New Roman" w:cs="Times New Roman"/>
+          <w:noProof/>
+          <w:color w:val="auto"/>
+        </w:rPr>
+        <w:t>3</w:t>
+      </w:r>
+      <w:r>
+        <w:rPr>
+          <w:rFonts w:ascii="Times New Roman" w:hAnsi="Times New Roman" w:cs="Times New Roman"/>
+          <w:color w:val="auto"/>
+        </w:rPr>
+        <w:fldChar w:fldCharType="end"/>
+      </w:r>
+      <w:r>
+        <w:rPr>
+          <w:rFonts w:ascii="Times New Roman" w:hAnsi="Times New Roman" w:cs="Times New Roman"/>
+          <w:color w:val="auto"/>
+        </w:rPr>
+        <w:t>.</w:t>
+      </w:r>
+      <w:r>
+        <w:t xml:space="preserve"> </w:t>
+      </w:r>
+      <w:r>
+        <w:rPr>
+          <w:rFonts w:ascii="Times New Roman" w:hAnsi="Times New Roman" w:cs="Times New Roman"/>
+          <w:color w:val="auto"/>
+        </w:rPr>
+        <w:t>Resultados esperados por etapa.</w:t>
+      </w:r>
     </w:p>
     <w:p>
       <w:pPr>
@@ -3619,40 +3752,7 @@
           <w:sz w:val="24"/>
           <w:szCs w:val="24"/>
         </w:rPr>
-        <w:t>4.</w:t>
-      </w:r>
-      <w:r>
-        <w:rPr>
-          <w:rFonts w:ascii="Times New Roman" w:hAnsi="Times New Roman" w:cs="Times New Roman"/>
-          <w:b/>
-          <w:bCs/>
-          <w:color w:val="auto"/>
-          <w:sz w:val="24"/>
-          <w:szCs w:val="24"/>
-        </w:rPr>
-        <w:t>4</w:t>
-      </w:r>
-      <w:r>
-        <w:rPr>
-          <w:rFonts w:ascii="Times New Roman" w:hAnsi="Times New Roman" w:cs="Times New Roman"/>
-          <w:b/>
-          <w:bCs/>
-          <w:color w:val="auto"/>
-          <w:sz w:val="24"/>
-          <w:szCs w:val="24"/>
-        </w:rPr>
-        <w:t xml:space="preserve"> </w:t>
-      </w:r>
-      <w:r>
-        <w:rPr>
-          <w:rFonts w:ascii="Times New Roman" w:hAnsi="Times New Roman" w:cs="Times New Roman"/>
-          <w:b/>
-          <w:bCs/>
-          <w:color w:val="auto"/>
-          <w:sz w:val="24"/>
-          <w:szCs w:val="24"/>
-        </w:rPr>
-        <w:t>Niveles de valor de la API</w:t>
+        <w:t>4.4 Niveles de valor de la API</w:t>
       </w:r>
     </w:p>
     <w:tbl>
@@ -3757,6 +3857,7 @@
               <w:rPr>
                 <w:rFonts w:ascii="Times New Roman" w:hAnsi="Times New Roman" w:cs="Times New Roman"/>
               </w:rPr>
+              <w:lastRenderedPageBreak/>
               <w:t>Conectividad de sistemas</w:t>
             </w:r>
           </w:p>
@@ -3831,7 +3932,6 @@
               <w:rPr>
                 <w:rFonts w:ascii="Times New Roman" w:hAnsi="Times New Roman" w:cs="Times New Roman"/>
               </w:rPr>
-              <w:lastRenderedPageBreak/>
               <w:t>Habilitación omnicanal</w:t>
             </w:r>
           </w:p>
@@ -3987,6 +4087,7 @@
           </w:tcPr>
           <w:p>
             <w:pPr>
+              <w:keepNext/>
               <w:spacing w:after="160" w:line="278" w:lineRule="auto"/>
               <w:rPr>
                 <w:rFonts w:ascii="Times New Roman" w:hAnsi="Times New Roman" w:cs="Times New Roman"/>
@@ -4002,6 +4103,73 @@
         </w:tc>
       </w:tr>
     </w:tbl>
+    <w:p>
+      <w:pPr>
+        <w:pStyle w:val="Descripcin"/>
+        <w:jc w:val="center"/>
+        <w:rPr>
+          <w:rFonts w:ascii="Times New Roman" w:hAnsi="Times New Roman" w:cs="Times New Roman"/>
+          <w:color w:val="auto"/>
+        </w:rPr>
+      </w:pPr>
+      <w:r>
+        <w:rPr>
+          <w:rFonts w:ascii="Times New Roman" w:hAnsi="Times New Roman" w:cs="Times New Roman"/>
+          <w:color w:val="auto"/>
+        </w:rPr>
+        <w:t xml:space="preserve">Tabla </w:t>
+      </w:r>
+      <w:r>
+        <w:rPr>
+          <w:rFonts w:ascii="Times New Roman" w:hAnsi="Times New Roman" w:cs="Times New Roman"/>
+          <w:color w:val="auto"/>
+        </w:rPr>
+        <w:fldChar w:fldCharType="begin"/>
+      </w:r>
+      <w:r>
+        <w:rPr>
+          <w:rFonts w:ascii="Times New Roman" w:hAnsi="Times New Roman" w:cs="Times New Roman"/>
+          <w:color w:val="auto"/>
+        </w:rPr>
+        <w:instrText xml:space="preserve"> SEQ Tabla \* ARABIC </w:instrText>
+      </w:r>
+      <w:r>
+        <w:rPr>
+          <w:rFonts w:ascii="Times New Roman" w:hAnsi="Times New Roman" w:cs="Times New Roman"/>
+          <w:color w:val="auto"/>
+        </w:rPr>
+        <w:fldChar w:fldCharType="separate"/>
+      </w:r>
+      <w:r>
+        <w:rPr>
+          <w:rFonts w:ascii="Times New Roman" w:hAnsi="Times New Roman" w:cs="Times New Roman"/>
+          <w:noProof/>
+          <w:color w:val="auto"/>
+        </w:rPr>
+        <w:t>4</w:t>
+      </w:r>
+      <w:r>
+        <w:rPr>
+          <w:rFonts w:ascii="Times New Roman" w:hAnsi="Times New Roman" w:cs="Times New Roman"/>
+          <w:color w:val="auto"/>
+        </w:rPr>
+        <w:fldChar w:fldCharType="end"/>
+      </w:r>
+      <w:r>
+        <w:rPr>
+          <w:rFonts w:ascii="Times New Roman" w:hAnsi="Times New Roman" w:cs="Times New Roman"/>
+          <w:color w:val="auto"/>
+        </w:rPr>
+        <w:t xml:space="preserve">. </w:t>
+      </w:r>
+      <w:r>
+        <w:rPr>
+          <w:rFonts w:ascii="Times New Roman" w:hAnsi="Times New Roman" w:cs="Times New Roman"/>
+          <w:color w:val="auto"/>
+        </w:rPr>
+        <w:t>Niveles de valor de la API</w:t>
+      </w:r>
+    </w:p>
     <w:p>
       <w:pPr>
         <w:tabs>
@@ -4050,18 +4218,7 @@
           <w:sz w:val="28"/>
           <w:szCs w:val="28"/>
         </w:rPr>
-        <w:t>5.</w:t>
-      </w:r>
-      <w:r>
-        <w:rPr>
-          <w:rFonts w:ascii="Times New Roman" w:hAnsi="Times New Roman" w:cs="Times New Roman"/>
-          <w:b/>
-          <w:bCs/>
-          <w:color w:val="auto"/>
-          <w:sz w:val="28"/>
-          <w:szCs w:val="28"/>
-        </w:rPr>
-        <w:t xml:space="preserve"> Modelo de negocio y monetización</w:t>
+        <w:t>5. Modelo de negocio y monetización</w:t>
       </w:r>
     </w:p>
     <w:p>
@@ -4413,6 +4570,7 @@
               <w:rPr>
                 <w:rFonts w:ascii="Times New Roman" w:hAnsi="Times New Roman" w:cs="Times New Roman"/>
               </w:rPr>
+              <w:lastRenderedPageBreak/>
               <w:t>Lógica económica</w:t>
             </w:r>
           </w:p>
@@ -4423,6 +4581,7 @@
           </w:tcPr>
           <w:p>
             <w:pPr>
+              <w:keepNext/>
               <w:jc w:val="both"/>
               <w:rPr>
                 <w:rFonts w:ascii="Times New Roman" w:hAnsi="Times New Roman" w:cs="Times New Roman"/>
@@ -4440,11 +4599,63 @@
     </w:tbl>
     <w:p>
       <w:pPr>
-        <w:jc w:val="both"/>
-        <w:rPr>
-          <w:rFonts w:ascii="Times New Roman" w:hAnsi="Times New Roman" w:cs="Times New Roman"/>
-        </w:rPr>
-      </w:pPr>
+        <w:pStyle w:val="Descripcin"/>
+        <w:jc w:val="center"/>
+        <w:rPr>
+          <w:rFonts w:ascii="Times New Roman" w:hAnsi="Times New Roman" w:cs="Times New Roman"/>
+          <w:color w:val="auto"/>
+        </w:rPr>
+      </w:pPr>
+      <w:r>
+        <w:rPr>
+          <w:rFonts w:ascii="Times New Roman" w:hAnsi="Times New Roman" w:cs="Times New Roman"/>
+          <w:color w:val="auto"/>
+        </w:rPr>
+        <w:t xml:space="preserve">Tabla </w:t>
+      </w:r>
+      <w:r>
+        <w:rPr>
+          <w:rFonts w:ascii="Times New Roman" w:hAnsi="Times New Roman" w:cs="Times New Roman"/>
+          <w:color w:val="auto"/>
+        </w:rPr>
+        <w:fldChar w:fldCharType="begin"/>
+      </w:r>
+      <w:r>
+        <w:rPr>
+          <w:rFonts w:ascii="Times New Roman" w:hAnsi="Times New Roman" w:cs="Times New Roman"/>
+          <w:color w:val="auto"/>
+        </w:rPr>
+        <w:instrText xml:space="preserve"> SEQ Tabla \* ARABIC </w:instrText>
+      </w:r>
+      <w:r>
+        <w:rPr>
+          <w:rFonts w:ascii="Times New Roman" w:hAnsi="Times New Roman" w:cs="Times New Roman"/>
+          <w:color w:val="auto"/>
+        </w:rPr>
+        <w:fldChar w:fldCharType="separate"/>
+      </w:r>
+      <w:r>
+        <w:rPr>
+          <w:rFonts w:ascii="Times New Roman" w:hAnsi="Times New Roman" w:cs="Times New Roman"/>
+          <w:noProof/>
+          <w:color w:val="auto"/>
+        </w:rPr>
+        <w:t>5</w:t>
+      </w:r>
+      <w:r>
+        <w:rPr>
+          <w:rFonts w:ascii="Times New Roman" w:hAnsi="Times New Roman" w:cs="Times New Roman"/>
+          <w:color w:val="auto"/>
+        </w:rPr>
+        <w:fldChar w:fldCharType="end"/>
+      </w:r>
+      <w:r>
+        <w:rPr>
+          <w:rFonts w:ascii="Times New Roman" w:hAnsi="Times New Roman" w:cs="Times New Roman"/>
+          <w:color w:val="auto"/>
+        </w:rPr>
+        <w:t>. Elementos del modelo de negocio</w:t>
+      </w:r>
     </w:p>
     <w:p>
       <w:pPr>
@@ -4467,7 +4678,6 @@
           <w:sz w:val="24"/>
           <w:szCs w:val="24"/>
         </w:rPr>
-        <w:lastRenderedPageBreak/>
         <w:t>5.2 Mecanismos de monetización</w:t>
       </w:r>
     </w:p>
@@ -4659,7 +4869,14 @@
         <w:rPr>
           <w:rFonts w:ascii="Times New Roman" w:hAnsi="Times New Roman" w:cs="Times New Roman"/>
         </w:rPr>
-        <w:t>La API de planes de ahorro constituye una capacidad de negocio integrada al ecosistema tecnológico del banco. Su función es exponer y coordinar las operaciones relacionadas con los planes de ahorro, manteniendo separados este dominio y las responsabilidades propias de los sistemas bancarios existentes.</w:t>
+        <w:t xml:space="preserve">La API de planes de ahorro constituye una capacidad de negocio integrada al ecosistema tecnológico del banco. Su función es exponer y coordinar las operaciones relacionadas </w:t>
+      </w:r>
+      <w:r>
+        <w:rPr>
+          <w:rFonts w:ascii="Times New Roman" w:hAnsi="Times New Roman" w:cs="Times New Roman"/>
+        </w:rPr>
+        <w:lastRenderedPageBreak/>
+        <w:t>con los planes de ahorro, manteniendo separados este dominio y las responsabilidades propias de los sistemas bancarios existentes.</w:t>
       </w:r>
     </w:p>
     <w:p>
@@ -4683,7 +4900,6 @@
           <w:sz w:val="24"/>
           <w:szCs w:val="24"/>
         </w:rPr>
-        <w:lastRenderedPageBreak/>
         <w:t>6.1 Clasificación</w:t>
       </w:r>
     </w:p>
@@ -4776,14 +4992,12 @@
         </w:rPr>
         <w:t xml:space="preserve">Integrada, porque depende del </w:t>
       </w:r>
-      <w:proofErr w:type="spellStart"/>
-      <w:r>
-        <w:rPr>
-          <w:rFonts w:ascii="Times New Roman" w:hAnsi="Times New Roman" w:cs="Times New Roman"/>
-        </w:rPr>
-        <w:t>core</w:t>
-      </w:r>
-      <w:proofErr w:type="spellEnd"/>
+      <w:r>
+        <w:rPr>
+          <w:rFonts w:ascii="Times New Roman" w:hAnsi="Times New Roman" w:cs="Times New Roman"/>
+        </w:rPr>
+        <w:t>Core</w:t>
+      </w:r>
       <w:r>
         <w:rPr>
           <w:rFonts w:ascii="Times New Roman" w:hAnsi="Times New Roman" w:cs="Times New Roman"/>
@@ -5184,6 +5398,7 @@
         <w:rPr>
           <w:rFonts w:ascii="Times New Roman" w:hAnsi="Times New Roman" w:cs="Times New Roman"/>
         </w:rPr>
+        <w:lastRenderedPageBreak/>
         <w:t>Calcular y mostrar la barra de progreso y el porcentaje de cumplimiento.</w:t>
       </w:r>
     </w:p>
@@ -5238,7 +5453,6 @@
         <w:rPr>
           <w:rFonts w:ascii="Times New Roman" w:hAnsi="Times New Roman" w:cs="Times New Roman"/>
         </w:rPr>
-        <w:lastRenderedPageBreak/>
         <w:t>Generar eventos relacionados con débitos y cambios del plan.</w:t>
       </w:r>
     </w:p>
@@ -5272,14 +5486,12 @@
         </w:rPr>
         <w:t xml:space="preserve">La API no ejecutará directamente las operaciones contables sobre las cuentas bancarias. El proceso de cobros solicitará las operaciones al </w:t>
       </w:r>
-      <w:proofErr w:type="spellStart"/>
-      <w:r>
-        <w:rPr>
-          <w:rFonts w:ascii="Times New Roman" w:hAnsi="Times New Roman" w:cs="Times New Roman"/>
-        </w:rPr>
-        <w:t>core</w:t>
-      </w:r>
-      <w:proofErr w:type="spellEnd"/>
+      <w:r>
+        <w:rPr>
+          <w:rFonts w:ascii="Times New Roman" w:hAnsi="Times New Roman" w:cs="Times New Roman"/>
+        </w:rPr>
+        <w:t>Core</w:t>
+      </w:r>
       <w:r>
         <w:rPr>
           <w:rFonts w:ascii="Times New Roman" w:hAnsi="Times New Roman" w:cs="Times New Roman"/>
@@ -5587,6 +5799,7 @@
           </w:tcPr>
           <w:p>
             <w:pPr>
+              <w:keepNext/>
               <w:spacing w:after="160" w:line="278" w:lineRule="auto"/>
               <w:rPr>
                 <w:rFonts w:ascii="Times New Roman" w:hAnsi="Times New Roman" w:cs="Times New Roman"/>
@@ -5602,6 +5815,73 @@
         </w:tc>
       </w:tr>
     </w:tbl>
+    <w:p>
+      <w:pPr>
+        <w:pStyle w:val="Descripcin"/>
+        <w:jc w:val="center"/>
+        <w:rPr>
+          <w:rFonts w:ascii="Times New Roman" w:hAnsi="Times New Roman" w:cs="Times New Roman"/>
+          <w:color w:val="auto"/>
+        </w:rPr>
+      </w:pPr>
+      <w:r>
+        <w:rPr>
+          <w:rFonts w:ascii="Times New Roman" w:hAnsi="Times New Roman" w:cs="Times New Roman"/>
+          <w:color w:val="auto"/>
+        </w:rPr>
+        <w:t xml:space="preserve">Tabla </w:t>
+      </w:r>
+      <w:r>
+        <w:rPr>
+          <w:rFonts w:ascii="Times New Roman" w:hAnsi="Times New Roman" w:cs="Times New Roman"/>
+          <w:color w:val="auto"/>
+        </w:rPr>
+        <w:fldChar w:fldCharType="begin"/>
+      </w:r>
+      <w:r>
+        <w:rPr>
+          <w:rFonts w:ascii="Times New Roman" w:hAnsi="Times New Roman" w:cs="Times New Roman"/>
+          <w:color w:val="auto"/>
+        </w:rPr>
+        <w:instrText xml:space="preserve"> SEQ Tabla \* ARABIC </w:instrText>
+      </w:r>
+      <w:r>
+        <w:rPr>
+          <w:rFonts w:ascii="Times New Roman" w:hAnsi="Times New Roman" w:cs="Times New Roman"/>
+          <w:color w:val="auto"/>
+        </w:rPr>
+        <w:fldChar w:fldCharType="separate"/>
+      </w:r>
+      <w:r>
+        <w:rPr>
+          <w:rFonts w:ascii="Times New Roman" w:hAnsi="Times New Roman" w:cs="Times New Roman"/>
+          <w:noProof/>
+          <w:color w:val="auto"/>
+        </w:rPr>
+        <w:t>6</w:t>
+      </w:r>
+      <w:r>
+        <w:rPr>
+          <w:rFonts w:ascii="Times New Roman" w:hAnsi="Times New Roman" w:cs="Times New Roman"/>
+          <w:color w:val="auto"/>
+        </w:rPr>
+        <w:fldChar w:fldCharType="end"/>
+      </w:r>
+      <w:r>
+        <w:rPr>
+          <w:rFonts w:ascii="Times New Roman" w:hAnsi="Times New Roman" w:cs="Times New Roman"/>
+          <w:color w:val="auto"/>
+        </w:rPr>
+        <w:t xml:space="preserve">. </w:t>
+      </w:r>
+      <w:r>
+        <w:rPr>
+          <w:rFonts w:ascii="Times New Roman" w:hAnsi="Times New Roman" w:cs="Times New Roman"/>
+          <w:color w:val="auto"/>
+        </w:rPr>
+        <w:t>Responsabilidades de los sistemas participantes</w:t>
+      </w:r>
+    </w:p>
     <w:p>
       <w:pPr>
         <w:spacing w:before="240"/>
@@ -5786,43 +6066,14 @@
               <w:rPr>
                 <w:rFonts w:ascii="Times New Roman" w:hAnsi="Times New Roman" w:cs="Times New Roman"/>
               </w:rPr>
-              <w:t xml:space="preserve">La interfaz, la API, el proceso de cobros y el </w:t>
-            </w:r>
-            <w:r>
-              <w:rPr>
-                <w:rFonts w:ascii="Times New Roman" w:hAnsi="Times New Roman" w:cs="Times New Roman"/>
-              </w:rPr>
-              <w:t>Core</w:t>
-            </w:r>
-            <w:r>
-              <w:rPr>
-                <w:rFonts w:ascii="Times New Roman" w:hAnsi="Times New Roman" w:cs="Times New Roman"/>
-              </w:rPr>
-              <w:t xml:space="preserve"> bancario mantienen responsabilidades separadas. El contrato OpenAPI permite que </w:t>
-            </w:r>
-            <w:r>
-              <w:rPr>
-                <w:rFonts w:ascii="Times New Roman" w:hAnsi="Times New Roman" w:cs="Times New Roman"/>
-              </w:rPr>
-              <w:t>Frontend</w:t>
-            </w:r>
-            <w:r>
-              <w:rPr>
-                <w:rFonts w:ascii="Times New Roman" w:hAnsi="Times New Roman" w:cs="Times New Roman"/>
-              </w:rPr>
-              <w:t xml:space="preserve"> y </w:t>
-            </w:r>
-            <w:r>
-              <w:rPr>
-                <w:rFonts w:ascii="Times New Roman" w:hAnsi="Times New Roman" w:cs="Times New Roman"/>
-              </w:rPr>
-              <w:t>Backend</w:t>
-            </w:r>
-            <w:r>
-              <w:rPr>
-                <w:rFonts w:ascii="Times New Roman" w:hAnsi="Times New Roman" w:cs="Times New Roman"/>
-              </w:rPr>
-              <w:t xml:space="preserve"> evolucionen de manera independiente.</w:t>
+              <w:t xml:space="preserve">La interfaz, la API, el proceso de cobros y el Core bancario mantienen responsabilidades separadas. El contrato OpenAPI </w:t>
+            </w:r>
+            <w:r>
+              <w:rPr>
+                <w:rFonts w:ascii="Times New Roman" w:hAnsi="Times New Roman" w:cs="Times New Roman"/>
+              </w:rPr>
+              <w:lastRenderedPageBreak/>
+              <w:t>permite que Frontend y Backend evolucionen de manera independiente.</w:t>
             </w:r>
           </w:p>
         </w:tc>
@@ -5844,6 +6095,7 @@
               <w:rPr>
                 <w:rFonts w:ascii="Times New Roman" w:hAnsi="Times New Roman" w:cs="Times New Roman"/>
               </w:rPr>
+              <w:lastRenderedPageBreak/>
               <w:t>Escalabilidad</w:t>
             </w:r>
           </w:p>
@@ -5886,7 +6138,6 @@
               <w:rPr>
                 <w:rFonts w:ascii="Times New Roman" w:hAnsi="Times New Roman" w:cs="Times New Roman"/>
               </w:rPr>
-              <w:lastRenderedPageBreak/>
               <w:t>Estandarización</w:t>
             </w:r>
           </w:p>
@@ -5940,6 +6191,7 @@
           </w:tcPr>
           <w:p>
             <w:pPr>
+              <w:keepNext/>
               <w:spacing w:after="160" w:line="278" w:lineRule="auto"/>
               <w:rPr>
                 <w:rFonts w:ascii="Times New Roman" w:hAnsi="Times New Roman" w:cs="Times New Roman"/>
@@ -5957,6 +6209,66 @@
     </w:tbl>
     <w:p>
       <w:pPr>
+        <w:pStyle w:val="Descripcin"/>
+        <w:jc w:val="center"/>
+        <w:rPr>
+          <w:rFonts w:ascii="Times New Roman" w:hAnsi="Times New Roman" w:cs="Times New Roman"/>
+          <w:color w:val="auto"/>
+        </w:rPr>
+      </w:pPr>
+      <w:r>
+        <w:rPr>
+          <w:rFonts w:ascii="Times New Roman" w:hAnsi="Times New Roman" w:cs="Times New Roman"/>
+          <w:color w:val="auto"/>
+        </w:rPr>
+        <w:t xml:space="preserve">Tabla </w:t>
+      </w:r>
+      <w:r>
+        <w:rPr>
+          <w:rFonts w:ascii="Times New Roman" w:hAnsi="Times New Roman" w:cs="Times New Roman"/>
+          <w:color w:val="auto"/>
+        </w:rPr>
+        <w:fldChar w:fldCharType="begin"/>
+      </w:r>
+      <w:r>
+        <w:rPr>
+          <w:rFonts w:ascii="Times New Roman" w:hAnsi="Times New Roman" w:cs="Times New Roman"/>
+          <w:color w:val="auto"/>
+        </w:rPr>
+        <w:instrText xml:space="preserve"> SEQ Tabla \* ARABIC </w:instrText>
+      </w:r>
+      <w:r>
+        <w:rPr>
+          <w:rFonts w:ascii="Times New Roman" w:hAnsi="Times New Roman" w:cs="Times New Roman"/>
+          <w:color w:val="auto"/>
+        </w:rPr>
+        <w:fldChar w:fldCharType="separate"/>
+      </w:r>
+      <w:r>
+        <w:rPr>
+          <w:rFonts w:ascii="Times New Roman" w:hAnsi="Times New Roman" w:cs="Times New Roman"/>
+          <w:noProof/>
+          <w:color w:val="auto"/>
+        </w:rPr>
+        <w:t>7</w:t>
+      </w:r>
+      <w:r>
+        <w:rPr>
+          <w:rFonts w:ascii="Times New Roman" w:hAnsi="Times New Roman" w:cs="Times New Roman"/>
+          <w:color w:val="auto"/>
+        </w:rPr>
+        <w:fldChar w:fldCharType="end"/>
+      </w:r>
+      <w:r>
+        <w:rPr>
+          <w:rFonts w:ascii="Times New Roman" w:hAnsi="Times New Roman" w:cs="Times New Roman"/>
+          <w:color w:val="auto"/>
+        </w:rPr>
+        <w:t>. Dimensiones de la API</w:t>
+      </w:r>
+    </w:p>
+    <w:p>
+      <w:pPr>
         <w:spacing w:before="240"/>
         <w:rPr>
           <w:rFonts w:ascii="Times New Roman" w:hAnsi="Times New Roman" w:cs="Times New Roman"/>
@@ -5966,19 +6278,7 @@
         <w:rPr>
           <w:rFonts w:ascii="Times New Roman" w:hAnsi="Times New Roman" w:cs="Times New Roman"/>
         </w:rPr>
-        <w:t xml:space="preserve">Estas dimensiones </w:t>
-      </w:r>
-      <w:r>
-        <w:rPr>
-          <w:rFonts w:ascii="Times New Roman" w:hAnsi="Times New Roman" w:cs="Times New Roman"/>
-        </w:rPr>
-        <w:t>establecen</w:t>
-      </w:r>
-      <w:r>
-        <w:rPr>
-          <w:rFonts w:ascii="Times New Roman" w:hAnsi="Times New Roman" w:cs="Times New Roman"/>
-        </w:rPr>
-        <w:t xml:space="preserve"> los principios generales del diseño. La selección detallada del estilo arquitectónico, los patrones y la infraestructura corresponde a la fase de arquitectura.</w:t>
+        <w:t>Estas dimensiones establecen los principios generales del diseño. La selección detallada del estilo arquitectónico, los patrones y la infraestructura corresponde a la fase de arquitectura.</w:t>
       </w:r>
     </w:p>
     <w:p>
@@ -6156,6 +6456,7 @@
         <w:rPr>
           <w:rFonts w:ascii="Times New Roman" w:hAnsi="Times New Roman" w:cs="Times New Roman"/>
         </w:rPr>
+        <w:lastRenderedPageBreak/>
         <w:t>Resultado esperado: disponer de un producto mínimo viable que pueda utilizarse, medirse y operarse dentro del ecosistema bancario.</w:t>
       </w:r>
     </w:p>
@@ -6189,14 +6490,7 @@
         <w:rPr>
           <w:rFonts w:ascii="Times New Roman" w:hAnsi="Times New Roman" w:cs="Times New Roman"/>
         </w:rPr>
-        <w:t xml:space="preserve">En la capa de negocio, el cliente desempeña el rol de ahorrador y utiliza el servicio de planes de ahorro digital. Este servicio comprende los procesos de simulación, </w:t>
-      </w:r>
-      <w:r>
-        <w:rPr>
-          <w:rFonts w:ascii="Times New Roman" w:hAnsi="Times New Roman" w:cs="Times New Roman"/>
-        </w:rPr>
-        <w:lastRenderedPageBreak/>
-        <w:t>configuración y creación del plan, cobro de aportes programados, consulta del progreso e historial, notificación de eventos y cancelación del plan.</w:t>
+        <w:t>En la capa de negocio, el cliente desempeña el rol de ahorrador y utiliza el servicio de planes de ahorro digital. Este servicio comprende los procesos de simulación, configuración y creación del plan, cobro de aportes programados, consulta del progreso e historial, notificación de eventos y cancelación del plan.</w:t>
       </w:r>
     </w:p>
     <w:p>
@@ -6213,7 +6507,13 @@
         <w:t>El objeto central del negocio es el plan de ahorro, cuyas condiciones deben ser aceptadas por el cliente. La fecha de débito funciona como el evento que inicia periódicamente el proceso de cobro del aporte programado.</w:t>
       </w:r>
     </w:p>
-    <w:p/>
+    <w:p>
+      <w:pPr>
+        <w:rPr>
+          <w:rFonts w:ascii="Times New Roman" w:hAnsi="Times New Roman" w:cs="Times New Roman"/>
+        </w:rPr>
+      </w:pPr>
+    </w:p>
     <w:p>
       <w:pPr>
         <w:pStyle w:val="Ttulo3"/>
@@ -6243,15 +6543,11 @@
         <w:jc w:val="both"/>
         <w:rPr>
           <w:rFonts w:ascii="Times New Roman" w:hAnsi="Times New Roman" w:cs="Times New Roman"/>
-          <w:sz w:val="22"/>
-          <w:szCs w:val="22"/>
-        </w:rPr>
-      </w:pPr>
-      <w:r>
-        <w:rPr>
-          <w:rFonts w:ascii="Times New Roman" w:hAnsi="Times New Roman" w:cs="Times New Roman"/>
-          <w:sz w:val="22"/>
-          <w:szCs w:val="22"/>
+        </w:rPr>
+      </w:pPr>
+      <w:r>
+        <w:rPr>
+          <w:rFonts w:ascii="Times New Roman" w:hAnsi="Times New Roman" w:cs="Times New Roman"/>
         </w:rPr>
         <w:t>La vista de aplicaciones muestra los componentes que participan en la prestación del servicio. El cliente accede mediante la aplicación bancaria web o móvil y utiliza un proceso guiado para simular y configurar el plan.</w:t>
       </w:r>
@@ -6261,15 +6557,11 @@
         <w:jc w:val="both"/>
         <w:rPr>
           <w:rFonts w:ascii="Times New Roman" w:hAnsi="Times New Roman" w:cs="Times New Roman"/>
-          <w:sz w:val="22"/>
-          <w:szCs w:val="22"/>
-        </w:rPr>
-      </w:pPr>
-      <w:r>
-        <w:rPr>
-          <w:rFonts w:ascii="Times New Roman" w:hAnsi="Times New Roman" w:cs="Times New Roman"/>
-          <w:sz w:val="22"/>
-          <w:szCs w:val="22"/>
+        </w:rPr>
+      </w:pPr>
+      <w:r>
+        <w:rPr>
+          <w:rFonts w:ascii="Times New Roman" w:hAnsi="Times New Roman" w:cs="Times New Roman"/>
         </w:rPr>
         <w:t>Las solicitudes son recibidas por el API Gateway, que controla el acceso y dirige las operaciones hacia el servicio de planes de ahorro. La simulación podrá ejecutarse sin autenticación, bajo las restricciones correspondientes, mientras que la creación y administración de planes requerirán la validación del cliente mediante el servicio institucional de identidad y acceso.</w:t>
       </w:r>
@@ -6279,15 +6571,11 @@
         <w:jc w:val="both"/>
         <w:rPr>
           <w:rFonts w:ascii="Times New Roman" w:hAnsi="Times New Roman" w:cs="Times New Roman"/>
-          <w:sz w:val="22"/>
-          <w:szCs w:val="22"/>
-        </w:rPr>
-      </w:pPr>
-      <w:r>
-        <w:rPr>
-          <w:rFonts w:ascii="Times New Roman" w:hAnsi="Times New Roman" w:cs="Times New Roman"/>
-          <w:sz w:val="22"/>
-          <w:szCs w:val="22"/>
+        </w:rPr>
+      </w:pPr>
+      <w:r>
+        <w:rPr>
+          <w:rFonts w:ascii="Times New Roman" w:hAnsi="Times New Roman" w:cs="Times New Roman"/>
         </w:rPr>
         <w:t>El servicio de planes de ahorro administra la lógica correspondiente a:</w:t>
       </w:r>
@@ -6302,33 +6590,13 @@
         <w:jc w:val="both"/>
         <w:rPr>
           <w:rFonts w:ascii="Times New Roman" w:hAnsi="Times New Roman" w:cs="Times New Roman"/>
-          <w:sz w:val="22"/>
-          <w:szCs w:val="22"/>
-        </w:rPr>
-      </w:pPr>
-      <w:r>
-        <w:rPr>
-          <w:rFonts w:ascii="Times New Roman" w:hAnsi="Times New Roman" w:cs="Times New Roman"/>
-          <w:sz w:val="22"/>
-          <w:szCs w:val="22"/>
-        </w:rPr>
-        <w:t>S</w:t>
-      </w:r>
-      <w:r>
-        <w:rPr>
-          <w:rFonts w:ascii="Times New Roman" w:hAnsi="Times New Roman" w:cs="Times New Roman"/>
-          <w:sz w:val="22"/>
-          <w:szCs w:val="22"/>
-        </w:rPr>
-        <w:t>imulación del ahorro</w:t>
-      </w:r>
-      <w:r>
-        <w:rPr>
-          <w:rFonts w:ascii="Times New Roman" w:hAnsi="Times New Roman" w:cs="Times New Roman"/>
-          <w:sz w:val="22"/>
-          <w:szCs w:val="22"/>
-        </w:rPr>
-        <w:t>.</w:t>
+        </w:rPr>
+      </w:pPr>
+      <w:r>
+        <w:rPr>
+          <w:rFonts w:ascii="Times New Roman" w:hAnsi="Times New Roman" w:cs="Times New Roman"/>
+        </w:rPr>
+        <w:t>Simulación del ahorro.</w:t>
       </w:r>
     </w:p>
     <w:p>
@@ -6341,33 +6609,13 @@
         <w:jc w:val="both"/>
         <w:rPr>
           <w:rFonts w:ascii="Times New Roman" w:hAnsi="Times New Roman" w:cs="Times New Roman"/>
-          <w:sz w:val="22"/>
-          <w:szCs w:val="22"/>
-        </w:rPr>
-      </w:pPr>
-      <w:r>
-        <w:rPr>
-          <w:rFonts w:ascii="Times New Roman" w:hAnsi="Times New Roman" w:cs="Times New Roman"/>
-          <w:sz w:val="22"/>
-          <w:szCs w:val="22"/>
-        </w:rPr>
-        <w:t>C</w:t>
-      </w:r>
-      <w:r>
-        <w:rPr>
-          <w:rFonts w:ascii="Times New Roman" w:hAnsi="Times New Roman" w:cs="Times New Roman"/>
-          <w:sz w:val="22"/>
-          <w:szCs w:val="22"/>
-        </w:rPr>
-        <w:t>reación y configuración de planes</w:t>
-      </w:r>
-      <w:r>
-        <w:rPr>
-          <w:rFonts w:ascii="Times New Roman" w:hAnsi="Times New Roman" w:cs="Times New Roman"/>
-          <w:sz w:val="22"/>
-          <w:szCs w:val="22"/>
-        </w:rPr>
-        <w:t>.</w:t>
+        </w:rPr>
+      </w:pPr>
+      <w:r>
+        <w:rPr>
+          <w:rFonts w:ascii="Times New Roman" w:hAnsi="Times New Roman" w:cs="Times New Roman"/>
+        </w:rPr>
+        <w:t>Creación y configuración de planes.</w:t>
       </w:r>
     </w:p>
     <w:p>
@@ -6380,33 +6628,13 @@
         <w:jc w:val="both"/>
         <w:rPr>
           <w:rFonts w:ascii="Times New Roman" w:hAnsi="Times New Roman" w:cs="Times New Roman"/>
-          <w:sz w:val="22"/>
-          <w:szCs w:val="22"/>
-        </w:rPr>
-      </w:pPr>
-      <w:r>
-        <w:rPr>
-          <w:rFonts w:ascii="Times New Roman" w:hAnsi="Times New Roman" w:cs="Times New Roman"/>
-          <w:sz w:val="22"/>
-          <w:szCs w:val="22"/>
-        </w:rPr>
-        <w:t>A</w:t>
-      </w:r>
-      <w:r>
-        <w:rPr>
-          <w:rFonts w:ascii="Times New Roman" w:hAnsi="Times New Roman" w:cs="Times New Roman"/>
-          <w:sz w:val="22"/>
-          <w:szCs w:val="22"/>
-        </w:rPr>
-        <w:t>dministración del bloqueo</w:t>
-      </w:r>
-      <w:r>
-        <w:rPr>
-          <w:rFonts w:ascii="Times New Roman" w:hAnsi="Times New Roman" w:cs="Times New Roman"/>
-          <w:sz w:val="22"/>
-          <w:szCs w:val="22"/>
-        </w:rPr>
-        <w:t>.</w:t>
+        </w:rPr>
+      </w:pPr>
+      <w:r>
+        <w:rPr>
+          <w:rFonts w:ascii="Times New Roman" w:hAnsi="Times New Roman" w:cs="Times New Roman"/>
+        </w:rPr>
+        <w:t>Administración del bloqueo.</w:t>
       </w:r>
     </w:p>
     <w:p>
@@ -6419,33 +6647,13 @@
         <w:jc w:val="both"/>
         <w:rPr>
           <w:rFonts w:ascii="Times New Roman" w:hAnsi="Times New Roman" w:cs="Times New Roman"/>
-          <w:sz w:val="22"/>
-          <w:szCs w:val="22"/>
-        </w:rPr>
-      </w:pPr>
-      <w:r>
-        <w:rPr>
-          <w:rFonts w:ascii="Times New Roman" w:hAnsi="Times New Roman" w:cs="Times New Roman"/>
-          <w:sz w:val="22"/>
-          <w:szCs w:val="22"/>
-        </w:rPr>
-        <w:t>S</w:t>
-      </w:r>
-      <w:r>
-        <w:rPr>
-          <w:rFonts w:ascii="Times New Roman" w:hAnsi="Times New Roman" w:cs="Times New Roman"/>
-          <w:sz w:val="22"/>
-          <w:szCs w:val="22"/>
-        </w:rPr>
-        <w:t>eguimiento del progreso</w:t>
-      </w:r>
-      <w:r>
-        <w:rPr>
-          <w:rFonts w:ascii="Times New Roman" w:hAnsi="Times New Roman" w:cs="Times New Roman"/>
-          <w:sz w:val="22"/>
-          <w:szCs w:val="22"/>
-        </w:rPr>
-        <w:t>.</w:t>
+        </w:rPr>
+      </w:pPr>
+      <w:r>
+        <w:rPr>
+          <w:rFonts w:ascii="Times New Roman" w:hAnsi="Times New Roman" w:cs="Times New Roman"/>
+        </w:rPr>
+        <w:t>Seguimiento del progreso.</w:t>
       </w:r>
     </w:p>
     <w:p>
@@ -6458,33 +6666,13 @@
         <w:jc w:val="both"/>
         <w:rPr>
           <w:rFonts w:ascii="Times New Roman" w:hAnsi="Times New Roman" w:cs="Times New Roman"/>
-          <w:sz w:val="22"/>
-          <w:szCs w:val="22"/>
-        </w:rPr>
-      </w:pPr>
-      <w:r>
-        <w:rPr>
-          <w:rFonts w:ascii="Times New Roman" w:hAnsi="Times New Roman" w:cs="Times New Roman"/>
-          <w:sz w:val="22"/>
-          <w:szCs w:val="22"/>
-        </w:rPr>
-        <w:t>C</w:t>
-      </w:r>
-      <w:r>
-        <w:rPr>
-          <w:rFonts w:ascii="Times New Roman" w:hAnsi="Times New Roman" w:cs="Times New Roman"/>
-          <w:sz w:val="22"/>
-          <w:szCs w:val="22"/>
-        </w:rPr>
-        <w:t>onsulta del historial</w:t>
-      </w:r>
-      <w:r>
-        <w:rPr>
-          <w:rFonts w:ascii="Times New Roman" w:hAnsi="Times New Roman" w:cs="Times New Roman"/>
-          <w:sz w:val="22"/>
-          <w:szCs w:val="22"/>
-        </w:rPr>
-        <w:t>.</w:t>
+        </w:rPr>
+      </w:pPr>
+      <w:r>
+        <w:rPr>
+          <w:rFonts w:ascii="Times New Roman" w:hAnsi="Times New Roman" w:cs="Times New Roman"/>
+        </w:rPr>
+        <w:t>Consulta del historial.</w:t>
       </w:r>
     </w:p>
     <w:p>
@@ -6497,33 +6685,13 @@
         <w:jc w:val="both"/>
         <w:rPr>
           <w:rFonts w:ascii="Times New Roman" w:hAnsi="Times New Roman" w:cs="Times New Roman"/>
-          <w:sz w:val="22"/>
-          <w:szCs w:val="22"/>
-        </w:rPr>
-      </w:pPr>
-      <w:r>
-        <w:rPr>
-          <w:rFonts w:ascii="Times New Roman" w:hAnsi="Times New Roman" w:cs="Times New Roman"/>
-          <w:sz w:val="22"/>
-          <w:szCs w:val="22"/>
-        </w:rPr>
-        <w:t>C</w:t>
-      </w:r>
-      <w:r>
-        <w:rPr>
-          <w:rFonts w:ascii="Times New Roman" w:hAnsi="Times New Roman" w:cs="Times New Roman"/>
-          <w:sz w:val="22"/>
-          <w:szCs w:val="22"/>
-        </w:rPr>
-        <w:t>oordinación de los aportes programados</w:t>
-      </w:r>
-      <w:r>
-        <w:rPr>
-          <w:rFonts w:ascii="Times New Roman" w:hAnsi="Times New Roman" w:cs="Times New Roman"/>
-          <w:sz w:val="22"/>
-          <w:szCs w:val="22"/>
-        </w:rPr>
-        <w:t>.</w:t>
+        </w:rPr>
+      </w:pPr>
+      <w:r>
+        <w:rPr>
+          <w:rFonts w:ascii="Times New Roman" w:hAnsi="Times New Roman" w:cs="Times New Roman"/>
+        </w:rPr>
+        <w:t>Coordinación de los aportes programados.</w:t>
       </w:r>
     </w:p>
     <w:p>
@@ -6536,33 +6704,13 @@
         <w:jc w:val="both"/>
         <w:rPr>
           <w:rFonts w:ascii="Times New Roman" w:hAnsi="Times New Roman" w:cs="Times New Roman"/>
-          <w:sz w:val="22"/>
-          <w:szCs w:val="22"/>
-        </w:rPr>
-      </w:pPr>
-      <w:r>
-        <w:rPr>
-          <w:rFonts w:ascii="Times New Roman" w:hAnsi="Times New Roman" w:cs="Times New Roman"/>
-          <w:sz w:val="22"/>
-          <w:szCs w:val="22"/>
-        </w:rPr>
-        <w:t>C</w:t>
-      </w:r>
-      <w:r>
-        <w:rPr>
-          <w:rFonts w:ascii="Times New Roman" w:hAnsi="Times New Roman" w:cs="Times New Roman"/>
-          <w:sz w:val="22"/>
-          <w:szCs w:val="22"/>
-        </w:rPr>
-        <w:t>ancelación de planes</w:t>
-      </w:r>
-      <w:r>
-        <w:rPr>
-          <w:rFonts w:ascii="Times New Roman" w:hAnsi="Times New Roman" w:cs="Times New Roman"/>
-          <w:sz w:val="22"/>
-          <w:szCs w:val="22"/>
-        </w:rPr>
-        <w:t>.</w:t>
+        </w:rPr>
+      </w:pPr>
+      <w:r>
+        <w:rPr>
+          <w:rFonts w:ascii="Times New Roman" w:hAnsi="Times New Roman" w:cs="Times New Roman"/>
+        </w:rPr>
+        <w:t>Cancelación de planes.</w:t>
       </w:r>
     </w:p>
     <w:p>
@@ -6575,25 +6723,13 @@
         <w:jc w:val="both"/>
         <w:rPr>
           <w:rFonts w:ascii="Times New Roman" w:hAnsi="Times New Roman" w:cs="Times New Roman"/>
-          <w:sz w:val="22"/>
-          <w:szCs w:val="22"/>
-        </w:rPr>
-      </w:pPr>
-      <w:r>
-        <w:rPr>
-          <w:rFonts w:ascii="Times New Roman" w:hAnsi="Times New Roman" w:cs="Times New Roman"/>
-          <w:sz w:val="22"/>
-          <w:szCs w:val="22"/>
-        </w:rPr>
-        <w:t>G</w:t>
-      </w:r>
-      <w:r>
-        <w:rPr>
-          <w:rFonts w:ascii="Times New Roman" w:hAnsi="Times New Roman" w:cs="Times New Roman"/>
-          <w:sz w:val="22"/>
-          <w:szCs w:val="22"/>
-        </w:rPr>
-        <w:t>eneración de eventos de notificación.</w:t>
+        </w:rPr>
+      </w:pPr>
+      <w:r>
+        <w:rPr>
+          <w:rFonts w:ascii="Times New Roman" w:hAnsi="Times New Roman" w:cs="Times New Roman"/>
+        </w:rPr>
+        <w:t>Generación de eventos de notificación.</w:t>
       </w:r>
     </w:p>
     <w:p>
@@ -6601,33 +6737,13 @@
         <w:jc w:val="both"/>
         <w:rPr>
           <w:rFonts w:ascii="Times New Roman" w:hAnsi="Times New Roman" w:cs="Times New Roman"/>
-          <w:sz w:val="22"/>
-          <w:szCs w:val="22"/>
-        </w:rPr>
-      </w:pPr>
-      <w:r>
-        <w:rPr>
-          <w:rFonts w:ascii="Times New Roman" w:hAnsi="Times New Roman" w:cs="Times New Roman"/>
-          <w:sz w:val="22"/>
-          <w:szCs w:val="22"/>
-        </w:rPr>
-        <w:t xml:space="preserve">El trabajador de débitos ejecuta las tareas programadas y solicita al </w:t>
-      </w:r>
-      <w:r>
-        <w:rPr>
-          <w:rFonts w:ascii="Times New Roman" w:hAnsi="Times New Roman" w:cs="Times New Roman"/>
-          <w:sz w:val="22"/>
-          <w:szCs w:val="22"/>
-        </w:rPr>
-        <w:t>Core</w:t>
-      </w:r>
-      <w:r>
-        <w:rPr>
-          <w:rFonts w:ascii="Times New Roman" w:hAnsi="Times New Roman" w:cs="Times New Roman"/>
-          <w:sz w:val="22"/>
-          <w:szCs w:val="22"/>
-        </w:rPr>
-        <w:t xml:space="preserve"> bancario el cobro de cada aporte. Cuando un débito no puede completarse, se aplicará la política de hasta cinco intentos, separados por periodos de 24 horas. Si el quinto intento falla, la cuota se cancela y el plazo del plan se extiende un mes, sin generar deuda acumulada.</w:t>
+        </w:rPr>
+      </w:pPr>
+      <w:r>
+        <w:rPr>
+          <w:rFonts w:ascii="Times New Roman" w:hAnsi="Times New Roman" w:cs="Times New Roman"/>
+        </w:rPr>
+        <w:t>El trabajador de débitos ejecuta las tareas programadas y solicita al Core bancario el cobro de cada aporte. Cuando un débito no puede completarse, se aplicará la política de hasta cinco intentos, separados por periodos de 24 horas. Si el quinto intento falla, la cuota se cancela y el plazo del plan se extiende un mes, sin generar deuda acumulada.</w:t>
       </w:r>
     </w:p>
     <w:p>
@@ -6635,33 +6751,13 @@
         <w:jc w:val="both"/>
         <w:rPr>
           <w:rFonts w:ascii="Times New Roman" w:hAnsi="Times New Roman" w:cs="Times New Roman"/>
-          <w:sz w:val="22"/>
-          <w:szCs w:val="22"/>
-        </w:rPr>
-      </w:pPr>
-      <w:r>
-        <w:rPr>
-          <w:rFonts w:ascii="Times New Roman" w:hAnsi="Times New Roman" w:cs="Times New Roman"/>
-          <w:sz w:val="22"/>
-          <w:szCs w:val="22"/>
-        </w:rPr>
-        <w:t xml:space="preserve">El </w:t>
-      </w:r>
-      <w:r>
-        <w:rPr>
-          <w:rFonts w:ascii="Times New Roman" w:hAnsi="Times New Roman" w:cs="Times New Roman"/>
-          <w:sz w:val="22"/>
-          <w:szCs w:val="22"/>
-        </w:rPr>
-        <w:t>Core</w:t>
-      </w:r>
-      <w:r>
-        <w:rPr>
-          <w:rFonts w:ascii="Times New Roman" w:hAnsi="Times New Roman" w:cs="Times New Roman"/>
-          <w:sz w:val="22"/>
-          <w:szCs w:val="22"/>
-        </w:rPr>
-        <w:t xml:space="preserve"> bancario mantiene la responsabilidad sobre las cuentas, los saldos, los movimientos contables, los débitos y el bloqueo efectivo de los fondos. El servicio institucional de notificaciones entrega los avisos generados por los eventos del plan.</w:t>
+        </w:rPr>
+      </w:pPr>
+      <w:r>
+        <w:rPr>
+          <w:rFonts w:ascii="Times New Roman" w:hAnsi="Times New Roman" w:cs="Times New Roman"/>
+        </w:rPr>
+        <w:t>El Core bancario mantiene la responsabilidad sobre las cuentas, los saldos, los movimientos contables, los débitos y el bloqueo efectivo de los fondos. El servicio institucional de notificaciones entrega los avisos generados por los eventos del plan.</w:t>
       </w:r>
     </w:p>
     <w:p>
@@ -6669,33 +6765,14 @@
         <w:jc w:val="both"/>
         <w:rPr>
           <w:rFonts w:ascii="Times New Roman" w:hAnsi="Times New Roman" w:cs="Times New Roman"/>
-          <w:sz w:val="22"/>
-          <w:szCs w:val="22"/>
-        </w:rPr>
-      </w:pPr>
-      <w:r>
-        <w:rPr>
-          <w:rFonts w:ascii="Times New Roman" w:hAnsi="Times New Roman" w:cs="Times New Roman"/>
-          <w:sz w:val="22"/>
-          <w:szCs w:val="22"/>
-        </w:rPr>
-        <w:t xml:space="preserve">La información propia del dominio se organiza en los registros del plan, el calendario de aportes y el historial inmutable de movimientos. Esta separación permite que la API administre el ciclo de vida del plan sin asumir las responsabilidades financieras y contables del </w:t>
-      </w:r>
-      <w:r>
-        <w:rPr>
-          <w:rFonts w:ascii="Times New Roman" w:hAnsi="Times New Roman" w:cs="Times New Roman"/>
-          <w:sz w:val="22"/>
-          <w:szCs w:val="22"/>
-        </w:rPr>
-        <w:t>Core</w:t>
-      </w:r>
-      <w:r>
-        <w:rPr>
-          <w:rFonts w:ascii="Times New Roman" w:hAnsi="Times New Roman" w:cs="Times New Roman"/>
-          <w:sz w:val="22"/>
-          <w:szCs w:val="22"/>
-        </w:rPr>
-        <w:t xml:space="preserve"> bancario.</w:t>
+        </w:rPr>
+      </w:pPr>
+      <w:r>
+        <w:rPr>
+          <w:rFonts w:ascii="Times New Roman" w:hAnsi="Times New Roman" w:cs="Times New Roman"/>
+        </w:rPr>
+        <w:lastRenderedPageBreak/>
+        <w:t>La información propia del dominio se organiza en los registros del plan, el calendario de aportes y el historial inmutable de movimientos. Esta separación permite que la API administre el ciclo de vida del plan sin asumir las responsabilidades financieras y contables del Core bancario.</w:t>
       </w:r>
     </w:p>
     <w:p>
@@ -6703,8 +6780,6 @@
         <w:jc w:val="both"/>
         <w:rPr>
           <w:rFonts w:ascii="Times New Roman" w:hAnsi="Times New Roman" w:cs="Times New Roman"/>
-          <w:sz w:val="22"/>
-          <w:szCs w:val="22"/>
         </w:rPr>
       </w:pPr>
     </w:p>
@@ -6729,40 +6804,7 @@
           <w:sz w:val="24"/>
           <w:szCs w:val="24"/>
         </w:rPr>
-        <w:t>7.</w:t>
-      </w:r>
-      <w:r>
-        <w:rPr>
-          <w:rFonts w:ascii="Times New Roman" w:hAnsi="Times New Roman" w:cs="Times New Roman"/>
-          <w:b/>
-          <w:bCs/>
-          <w:color w:val="auto"/>
-          <w:sz w:val="24"/>
-          <w:szCs w:val="24"/>
-        </w:rPr>
-        <w:t>3</w:t>
-      </w:r>
-      <w:r>
-        <w:rPr>
-          <w:rFonts w:ascii="Times New Roman" w:hAnsi="Times New Roman" w:cs="Times New Roman"/>
-          <w:b/>
-          <w:bCs/>
-          <w:color w:val="auto"/>
-          <w:sz w:val="24"/>
-          <w:szCs w:val="24"/>
-        </w:rPr>
-        <w:t xml:space="preserve"> Vista de </w:t>
-      </w:r>
-      <w:r>
-        <w:rPr>
-          <w:rFonts w:ascii="Times New Roman" w:hAnsi="Times New Roman" w:cs="Times New Roman"/>
-          <w:b/>
-          <w:bCs/>
-          <w:color w:val="auto"/>
-          <w:sz w:val="24"/>
-          <w:szCs w:val="24"/>
-        </w:rPr>
-        <w:t>infraestructura</w:t>
+        <w:t>7.3 Vista de infraestructura</w:t>
       </w:r>
     </w:p>
     <w:p>
@@ -6770,83 +6812,173 @@
         <w:jc w:val="both"/>
         <w:rPr>
           <w:rFonts w:ascii="Times New Roman" w:hAnsi="Times New Roman" w:cs="Times New Roman"/>
+        </w:rPr>
+      </w:pPr>
+      <w:r>
+        <w:rPr>
+          <w:rFonts w:ascii="Times New Roman" w:hAnsi="Times New Roman" w:cs="Times New Roman"/>
+        </w:rPr>
+        <w:t>La vista de infraestructura presenta los recursos necesarios para ejecutar los componentes de la nueva funcionalidad. La API y el trabajador de débitos se desplegarán en una plataforma de ejecución basada en contenedores.</w:t>
+      </w:r>
+    </w:p>
+    <w:p>
+      <w:pPr>
+        <w:jc w:val="both"/>
+        <w:rPr>
+          <w:rFonts w:ascii="Times New Roman" w:hAnsi="Times New Roman" w:cs="Times New Roman"/>
+        </w:rPr>
+      </w:pPr>
+      <w:r>
+        <w:rPr>
+          <w:rFonts w:ascii="Times New Roman" w:hAnsi="Times New Roman" w:cs="Times New Roman"/>
+        </w:rPr>
+        <w:t>La solución utilizará una base de datos relacional para almacenar los planes, calendarios de aportes y movimientos. También contará con mecanismos de mensajería o eventos para coordinar procesos como las notificaciones, además de servicios de gestión de secretos, cifrado, registros, métricas y trazas.</w:t>
+      </w:r>
+    </w:p>
+    <w:p>
+      <w:pPr>
+        <w:jc w:val="both"/>
+        <w:rPr>
+          <w:rFonts w:ascii="Times New Roman" w:hAnsi="Times New Roman" w:cs="Times New Roman"/>
+        </w:rPr>
+      </w:pPr>
+      <w:r>
+        <w:rPr>
+          <w:rFonts w:ascii="Times New Roman" w:hAnsi="Times New Roman" w:cs="Times New Roman"/>
+        </w:rPr>
+        <w:t xml:space="preserve">La infraestructura reutilizará los servicios existentes de identidad, </w:t>
+      </w:r>
+      <w:r>
+        <w:rPr>
+          <w:rFonts w:ascii="Times New Roman" w:hAnsi="Times New Roman" w:cs="Times New Roman"/>
+        </w:rPr>
+        <w:t>Core</w:t>
+      </w:r>
+      <w:r>
+        <w:rPr>
+          <w:rFonts w:ascii="Times New Roman" w:hAnsi="Times New Roman" w:cs="Times New Roman"/>
+        </w:rPr>
+        <w:t xml:space="preserve"> bancario y notificaciones. Por tanto, el nuevo despliegue se concentrará en la API, el trabajador de débitos y el almacenamiento correspondiente al dominio de planes de ahorro.</w:t>
+      </w:r>
+    </w:p>
+    <w:p>
+      <w:pPr>
+        <w:keepNext/>
+        <w:jc w:val="center"/>
+        <w:rPr>
+          <w:rFonts w:ascii="Times New Roman" w:hAnsi="Times New Roman" w:cs="Times New Roman"/>
+        </w:rPr>
+      </w:pPr>
+      <w:r>
+        <w:rPr>
+          <w:rFonts w:ascii="Times New Roman" w:hAnsi="Times New Roman" w:cs="Times New Roman"/>
+          <w:noProof/>
           <w:sz w:val="22"/>
           <w:szCs w:val="22"/>
         </w:rPr>
-      </w:pPr>
-      <w:r>
+        <w:drawing>
+          <wp:inline distT="0" distB="0" distL="0" distR="0" wp14:anchorId="2D361329" wp14:editId="5C76CA98">
+            <wp:extent cx="5192637" cy="4784140"/>
+            <wp:effectExtent l="0" t="0" r="8255" b="0"/>
+            <wp:docPr id="1645839346" name="Imagen 2"/>
+            <wp:cNvGraphicFramePr>
+              <a:graphicFrameLocks xmlns:a="http://schemas.openxmlformats.org/drawingml/2006/main" noChangeAspect="1"/>
+            </wp:cNvGraphicFramePr>
+            <a:graphic xmlns:a="http://schemas.openxmlformats.org/drawingml/2006/main">
+              <a:graphicData uri="http://schemas.openxmlformats.org/drawingml/2006/picture">
+                <pic:pic xmlns:pic="http://schemas.openxmlformats.org/drawingml/2006/picture">
+                  <pic:nvPicPr>
+                    <pic:cNvPr id="0" name="Picture 6"/>
+                    <pic:cNvPicPr>
+                      <a:picLocks noChangeAspect="1" noChangeArrowheads="1"/>
+                    </pic:cNvPicPr>
+                  </pic:nvPicPr>
+                  <pic:blipFill>
+                    <a:blip r:embed="rId6" cstate="print">
+                      <a:extLst>
+                        <a:ext uri="{28A0092B-C50C-407E-A947-70E740481C1C}">
+                          <a14:useLocalDpi xmlns:a14="http://schemas.microsoft.com/office/drawing/2010/main" val="0"/>
+                        </a:ext>
+                      </a:extLst>
+                    </a:blip>
+                    <a:srcRect/>
+                    <a:stretch>
+                      <a:fillRect/>
+                    </a:stretch>
+                  </pic:blipFill>
+                  <pic:spPr bwMode="auto">
+                    <a:xfrm>
+                      <a:off x="0" y="0"/>
+                      <a:ext cx="5198417" cy="4789466"/>
+                    </a:xfrm>
+                    <a:prstGeom prst="rect">
+                      <a:avLst/>
+                    </a:prstGeom>
+                    <a:noFill/>
+                    <a:ln>
+                      <a:noFill/>
+                    </a:ln>
+                  </pic:spPr>
+                </pic:pic>
+              </a:graphicData>
+            </a:graphic>
+          </wp:inline>
+        </w:drawing>
+      </w:r>
+    </w:p>
+    <w:p>
+      <w:pPr>
+        <w:pStyle w:val="Descripcin"/>
+        <w:jc w:val="center"/>
         <w:rPr>
           <w:rFonts w:ascii="Times New Roman" w:hAnsi="Times New Roman" w:cs="Times New Roman"/>
           <w:sz w:val="22"/>
           <w:szCs w:val="22"/>
         </w:rPr>
-        <w:t>La vista de infraestructura presenta los recursos necesarios para ejecutar los componentes de la nueva funcionalidad. La API y el trabajador de débitos se desplegarán en una plataforma de ejecución basada en contenedores.</w:t>
-      </w:r>
-    </w:p>
-    <w:p>
-      <w:pPr>
-        <w:jc w:val="both"/>
-        <w:rPr>
-          <w:rFonts w:ascii="Times New Roman" w:hAnsi="Times New Roman" w:cs="Times New Roman"/>
-          <w:sz w:val="22"/>
-          <w:szCs w:val="22"/>
-        </w:rPr>
-      </w:pPr>
-      <w:r>
-        <w:rPr>
-          <w:rFonts w:ascii="Times New Roman" w:hAnsi="Times New Roman" w:cs="Times New Roman"/>
-          <w:sz w:val="22"/>
-          <w:szCs w:val="22"/>
-        </w:rPr>
-        <w:lastRenderedPageBreak/>
-        <w:t>La solución utilizará una base de datos relacional para almacenar los planes, calendarios de aportes y movimientos. También contará con mecanismos de mensajería o eventos para coordinar procesos como las notificaciones, además de servicios de gestión de secretos, cifrado, registros, métricas y trazas.</w:t>
-      </w:r>
-    </w:p>
-    <w:p>
-      <w:pPr>
-        <w:jc w:val="both"/>
-        <w:rPr>
-          <w:rFonts w:ascii="Times New Roman" w:hAnsi="Times New Roman" w:cs="Times New Roman"/>
-          <w:sz w:val="22"/>
-          <w:szCs w:val="22"/>
-        </w:rPr>
-      </w:pPr>
-      <w:r>
-        <w:rPr>
-          <w:rFonts w:ascii="Times New Roman" w:hAnsi="Times New Roman" w:cs="Times New Roman"/>
-          <w:sz w:val="22"/>
-          <w:szCs w:val="22"/>
-        </w:rPr>
-        <w:t xml:space="preserve">La infraestructura reutilizará los servicios existentes de identidad, </w:t>
-      </w:r>
-      <w:proofErr w:type="spellStart"/>
-      <w:r>
-        <w:rPr>
-          <w:rFonts w:ascii="Times New Roman" w:hAnsi="Times New Roman" w:cs="Times New Roman"/>
-          <w:sz w:val="22"/>
-          <w:szCs w:val="22"/>
-        </w:rPr>
-        <w:t>core</w:t>
-      </w:r>
-      <w:proofErr w:type="spellEnd"/>
-      <w:r>
-        <w:rPr>
-          <w:rFonts w:ascii="Times New Roman" w:hAnsi="Times New Roman" w:cs="Times New Roman"/>
-          <w:sz w:val="22"/>
-          <w:szCs w:val="22"/>
-        </w:rPr>
-        <w:t xml:space="preserve"> bancario y notificaciones. Por tanto, el nuevo despliegue se concentrará en la API, el trabajador de débitos y el almacenamiento correspondiente al dominio de planes de ahorro.</w:t>
-      </w:r>
-    </w:p>
-    <w:p>
-      <w:pPr>
-        <w:jc w:val="both"/>
-        <w:rPr>
-          <w:rFonts w:ascii="Times New Roman" w:hAnsi="Times New Roman" w:cs="Times New Roman"/>
-          <w:sz w:val="22"/>
-          <w:szCs w:val="22"/>
-        </w:rPr>
-      </w:pPr>
+      </w:pPr>
+      <w:r>
+        <w:rPr>
+          <w:rFonts w:ascii="Times New Roman" w:hAnsi="Times New Roman" w:cs="Times New Roman"/>
+        </w:rPr>
+        <w:t xml:space="preserve">Ilustración </w:t>
+      </w:r>
+      <w:r>
+        <w:rPr>
+          <w:rFonts w:ascii="Times New Roman" w:hAnsi="Times New Roman" w:cs="Times New Roman"/>
+        </w:rPr>
+        <w:fldChar w:fldCharType="begin"/>
+      </w:r>
+      <w:r>
+        <w:rPr>
+          <w:rFonts w:ascii="Times New Roman" w:hAnsi="Times New Roman" w:cs="Times New Roman"/>
+        </w:rPr>
+        <w:instrText xml:space="preserve"> SEQ Ilustración \* ARABIC </w:instrText>
+      </w:r>
+      <w:r>
+        <w:rPr>
+          <w:rFonts w:ascii="Times New Roman" w:hAnsi="Times New Roman" w:cs="Times New Roman"/>
+        </w:rPr>
+        <w:fldChar w:fldCharType="separate"/>
+      </w:r>
+      <w:r>
+        <w:rPr>
+          <w:rFonts w:ascii="Times New Roman" w:hAnsi="Times New Roman" w:cs="Times New Roman"/>
+          <w:noProof/>
+        </w:rPr>
+        <w:t>1</w:t>
+      </w:r>
+      <w:r>
+        <w:rPr>
+          <w:rFonts w:ascii="Times New Roman" w:hAnsi="Times New Roman" w:cs="Times New Roman"/>
+        </w:rPr>
+        <w:fldChar w:fldCharType="end"/>
+      </w:r>
+      <w:r>
+        <w:rPr>
+          <w:rFonts w:ascii="Times New Roman" w:hAnsi="Times New Roman" w:cs="Times New Roman"/>
+        </w:rPr>
+        <w:t>. Vista ArchiMate integrada de la API de planes de ahorro bancario</w:t>
+      </w:r>
     </w:p>
     <w:p>
       <w:pPr>
@@ -6884,56 +7016,42 @@
     </w:p>
     <w:p>
       <w:pPr>
-        <w:rPr>
-          <w:rFonts w:ascii="Times New Roman" w:hAnsi="Times New Roman" w:cs="Times New Roman"/>
-          <w:sz w:val="22"/>
-          <w:szCs w:val="22"/>
-        </w:rPr>
-      </w:pPr>
-      <w:r>
-        <w:rPr>
-          <w:rFonts w:ascii="Times New Roman" w:hAnsi="Times New Roman" w:cs="Times New Roman"/>
-          <w:sz w:val="22"/>
-          <w:szCs w:val="22"/>
-        </w:rPr>
-        <w:t>Una tabla compacta:</w:t>
+        <w:jc w:val="both"/>
+        <w:rPr>
+          <w:rFonts w:ascii="Times New Roman" w:hAnsi="Times New Roman" w:cs="Times New Roman"/>
+        </w:rPr>
+      </w:pPr>
+      <w:r>
+        <w:rPr>
+          <w:rFonts w:ascii="Times New Roman" w:hAnsi="Times New Roman" w:cs="Times New Roman"/>
+        </w:rPr>
+        <w:t>La implementación de la API depende de condiciones operativas y capacidades existentes dentro del ecosistema bancario. La siguiente tabla presenta los principales supuestos, dependencias, riesgos y restricciones considerados para el alcance del producto.</w:t>
       </w:r>
     </w:p>
     <w:tbl>
       <w:tblPr>
+        <w:tblStyle w:val="Tablaconcuadrcula"/>
         <w:tblW w:w="0" w:type="auto"/>
-        <w:tblCellSpacing w:w="15" w:type="dxa"/>
-        <w:tblCellMar>
-          <w:top w:w="15" w:type="dxa"/>
-          <w:left w:w="15" w:type="dxa"/>
-          <w:bottom w:w="15" w:type="dxa"/>
-          <w:right w:w="15" w:type="dxa"/>
-        </w:tblCellMar>
         <w:tblLook w:val="04A0" w:firstRow="1" w:lastRow="0" w:firstColumn="1" w:lastColumn="0" w:noHBand="0" w:noVBand="1"/>
       </w:tblPr>
       <w:tblGrid>
-        <w:gridCol w:w="1224"/>
-        <w:gridCol w:w="6776"/>
+        <w:gridCol w:w="1469"/>
+        <w:gridCol w:w="7025"/>
       </w:tblGrid>
       <w:tr>
-        <w:trPr>
-          <w:tblHeader/>
-          <w:tblCellSpacing w:w="15" w:type="dxa"/>
-        </w:trPr>
         <w:tc>
           <w:tcPr>
             <w:tcW w:w="0" w:type="auto"/>
-            <w:vAlign w:val="center"/>
             <w:hideMark/>
           </w:tcPr>
           <w:p>
             <w:pPr>
+              <w:spacing w:after="160" w:line="278" w:lineRule="auto"/>
+              <w:jc w:val="both"/>
               <w:rPr>
                 <w:rFonts w:ascii="Times New Roman" w:hAnsi="Times New Roman" w:cs="Times New Roman"/>
                 <w:b/>
                 <w:bCs/>
-                <w:sz w:val="22"/>
-                <w:szCs w:val="22"/>
               </w:rPr>
             </w:pPr>
             <w:r>
@@ -6941,8 +7059,6 @@
                 <w:rFonts w:ascii="Times New Roman" w:hAnsi="Times New Roman" w:cs="Times New Roman"/>
                 <w:b/>
                 <w:bCs/>
-                <w:sz w:val="22"/>
-                <w:szCs w:val="22"/>
               </w:rPr>
               <w:t>Tipo</w:t>
             </w:r>
@@ -6951,17 +7067,16 @@
         <w:tc>
           <w:tcPr>
             <w:tcW w:w="0" w:type="auto"/>
-            <w:vAlign w:val="center"/>
             <w:hideMark/>
           </w:tcPr>
           <w:p>
             <w:pPr>
+              <w:spacing w:after="160" w:line="278" w:lineRule="auto"/>
+              <w:jc w:val="both"/>
               <w:rPr>
                 <w:rFonts w:ascii="Times New Roman" w:hAnsi="Times New Roman" w:cs="Times New Roman"/>
                 <w:b/>
                 <w:bCs/>
-                <w:sz w:val="22"/>
-                <w:szCs w:val="22"/>
               </w:rPr>
             </w:pPr>
             <w:r>
@@ -6969,8 +7084,6 @@
                 <w:rFonts w:ascii="Times New Roman" w:hAnsi="Times New Roman" w:cs="Times New Roman"/>
                 <w:b/>
                 <w:bCs/>
-                <w:sz w:val="22"/>
-                <w:szCs w:val="22"/>
               </w:rPr>
               <w:t>Descripción</w:t>
             </w:r>
@@ -6978,28 +7091,22 @@
         </w:tc>
       </w:tr>
       <w:tr>
-        <w:trPr>
-          <w:tblCellSpacing w:w="15" w:type="dxa"/>
-        </w:trPr>
         <w:tc>
           <w:tcPr>
             <w:tcW w:w="0" w:type="auto"/>
-            <w:vAlign w:val="center"/>
             <w:hideMark/>
           </w:tcPr>
           <w:p>
             <w:pPr>
-              <w:rPr>
-                <w:rFonts w:ascii="Times New Roman" w:hAnsi="Times New Roman" w:cs="Times New Roman"/>
-                <w:sz w:val="22"/>
-                <w:szCs w:val="22"/>
+              <w:spacing w:after="160" w:line="278" w:lineRule="auto"/>
+              <w:jc w:val="both"/>
+              <w:rPr>
+                <w:rFonts w:ascii="Times New Roman" w:hAnsi="Times New Roman" w:cs="Times New Roman"/>
               </w:rPr>
             </w:pPr>
             <w:r>
               <w:rPr>
                 <w:rFonts w:ascii="Times New Roman" w:hAnsi="Times New Roman" w:cs="Times New Roman"/>
-                <w:sz w:val="22"/>
-                <w:szCs w:val="22"/>
               </w:rPr>
               <w:t>Supuesto</w:t>
             </w:r>
@@ -7008,51 +7115,42 @@
         <w:tc>
           <w:tcPr>
             <w:tcW w:w="0" w:type="auto"/>
-            <w:vAlign w:val="center"/>
             <w:hideMark/>
           </w:tcPr>
           <w:p>
             <w:pPr>
-              <w:rPr>
-                <w:rFonts w:ascii="Times New Roman" w:hAnsi="Times New Roman" w:cs="Times New Roman"/>
-                <w:sz w:val="22"/>
-                <w:szCs w:val="22"/>
+              <w:spacing w:after="160" w:line="278" w:lineRule="auto"/>
+              <w:jc w:val="both"/>
+              <w:rPr>
+                <w:rFonts w:ascii="Times New Roman" w:hAnsi="Times New Roman" w:cs="Times New Roman"/>
               </w:rPr>
             </w:pPr>
             <w:r>
               <w:rPr>
                 <w:rFonts w:ascii="Times New Roman" w:hAnsi="Times New Roman" w:cs="Times New Roman"/>
-                <w:sz w:val="22"/>
-                <w:szCs w:val="22"/>
-              </w:rPr>
-              <w:t>El cliente ya dispone de una cuenta bancaria activa</w:t>
+              </w:rPr>
+              <w:t>El cliente dispone de una cuenta bancaria activa y habilitada para crear un plan y realizar los aportes programados. Este requisito no aplica a la simulación pública y anónima.</w:t>
             </w:r>
           </w:p>
         </w:tc>
       </w:tr>
       <w:tr>
-        <w:trPr>
-          <w:tblCellSpacing w:w="15" w:type="dxa"/>
-        </w:trPr>
         <w:tc>
           <w:tcPr>
             <w:tcW w:w="0" w:type="auto"/>
-            <w:vAlign w:val="center"/>
             <w:hideMark/>
           </w:tcPr>
           <w:p>
             <w:pPr>
-              <w:rPr>
-                <w:rFonts w:ascii="Times New Roman" w:hAnsi="Times New Roman" w:cs="Times New Roman"/>
-                <w:sz w:val="22"/>
-                <w:szCs w:val="22"/>
+              <w:spacing w:after="160" w:line="278" w:lineRule="auto"/>
+              <w:jc w:val="both"/>
+              <w:rPr>
+                <w:rFonts w:ascii="Times New Roman" w:hAnsi="Times New Roman" w:cs="Times New Roman"/>
               </w:rPr>
             </w:pPr>
             <w:r>
               <w:rPr>
                 <w:rFonts w:ascii="Times New Roman" w:hAnsi="Times New Roman" w:cs="Times New Roman"/>
-                <w:sz w:val="22"/>
-                <w:szCs w:val="22"/>
               </w:rPr>
               <w:t>Supuesto</w:t>
             </w:r>
@@ -7061,318 +7159,682 @@
         <w:tc>
           <w:tcPr>
             <w:tcW w:w="0" w:type="auto"/>
-            <w:vAlign w:val="center"/>
             <w:hideMark/>
           </w:tcPr>
           <w:p>
             <w:pPr>
-              <w:rPr>
-                <w:rFonts w:ascii="Times New Roman" w:hAnsi="Times New Roman" w:cs="Times New Roman"/>
-                <w:sz w:val="22"/>
-                <w:szCs w:val="22"/>
+              <w:spacing w:after="160" w:line="278" w:lineRule="auto"/>
+              <w:jc w:val="both"/>
+              <w:rPr>
+                <w:rFonts w:ascii="Times New Roman" w:hAnsi="Times New Roman" w:cs="Times New Roman"/>
               </w:rPr>
             </w:pPr>
             <w:r>
               <w:rPr>
                 <w:rFonts w:ascii="Times New Roman" w:hAnsi="Times New Roman" w:cs="Times New Roman"/>
-                <w:sz w:val="22"/>
-                <w:szCs w:val="22"/>
-              </w:rPr>
-              <w:t xml:space="preserve">El </w:t>
-            </w:r>
-            <w:r>
-              <w:rPr>
-                <w:rFonts w:ascii="Times New Roman" w:hAnsi="Times New Roman" w:cs="Times New Roman"/>
-                <w:sz w:val="22"/>
-                <w:szCs w:val="22"/>
-              </w:rPr>
-              <w:t>Core</w:t>
-            </w:r>
-            <w:r>
-              <w:rPr>
-                <w:rFonts w:ascii="Times New Roman" w:hAnsi="Times New Roman" w:cs="Times New Roman"/>
-                <w:sz w:val="22"/>
-                <w:szCs w:val="22"/>
-              </w:rPr>
-              <w:t xml:space="preserve"> ofrece interfaces para consultar cuentas y ejecutar débitos</w:t>
+              </w:rPr>
+              <w:t>El Core bancario ofrece interfaces para consultar cuentas, ejecutar débitos, bloquear fondos y devolver el dinero cuando un plan sea cancelado o completado.</w:t>
             </w:r>
           </w:p>
         </w:tc>
       </w:tr>
       <w:tr>
-        <w:trPr>
-          <w:tblCellSpacing w:w="15" w:type="dxa"/>
-        </w:trPr>
         <w:tc>
           <w:tcPr>
             <w:tcW w:w="0" w:type="auto"/>
-            <w:vAlign w:val="center"/>
             <w:hideMark/>
           </w:tcPr>
           <w:p>
             <w:pPr>
-              <w:rPr>
-                <w:rFonts w:ascii="Times New Roman" w:hAnsi="Times New Roman" w:cs="Times New Roman"/>
-                <w:sz w:val="22"/>
-                <w:szCs w:val="22"/>
+              <w:spacing w:after="160" w:line="278" w:lineRule="auto"/>
+              <w:jc w:val="both"/>
+              <w:rPr>
+                <w:rFonts w:ascii="Times New Roman" w:hAnsi="Times New Roman" w:cs="Times New Roman"/>
               </w:rPr>
             </w:pPr>
             <w:r>
               <w:rPr>
                 <w:rFonts w:ascii="Times New Roman" w:hAnsi="Times New Roman" w:cs="Times New Roman"/>
-                <w:sz w:val="22"/>
-                <w:szCs w:val="22"/>
-              </w:rPr>
-              <w:t>Dependencia</w:t>
+              </w:rPr>
+              <w:t>Supuesto</w:t>
             </w:r>
           </w:p>
         </w:tc>
         <w:tc>
           <w:tcPr>
             <w:tcW w:w="0" w:type="auto"/>
-            <w:vAlign w:val="center"/>
             <w:hideMark/>
           </w:tcPr>
           <w:p>
             <w:pPr>
-              <w:rPr>
-                <w:rFonts w:ascii="Times New Roman" w:hAnsi="Times New Roman" w:cs="Times New Roman"/>
-                <w:sz w:val="22"/>
-                <w:szCs w:val="22"/>
+              <w:spacing w:after="160" w:line="278" w:lineRule="auto"/>
+              <w:jc w:val="both"/>
+              <w:rPr>
+                <w:rFonts w:ascii="Times New Roman" w:hAnsi="Times New Roman" w:cs="Times New Roman"/>
               </w:rPr>
             </w:pPr>
             <w:r>
               <w:rPr>
                 <w:rFonts w:ascii="Times New Roman" w:hAnsi="Times New Roman" w:cs="Times New Roman"/>
-                <w:sz w:val="22"/>
-                <w:szCs w:val="22"/>
-              </w:rPr>
-              <w:t>La API depende de servicios bancarios preexistentes</w:t>
+              </w:rPr>
+              <w:t>Las tasas y condiciones utilizadas por la simulación son proporcionadas y actualizadas por el banco.</w:t>
             </w:r>
           </w:p>
         </w:tc>
       </w:tr>
       <w:tr>
-        <w:trPr>
-          <w:tblCellSpacing w:w="15" w:type="dxa"/>
-        </w:trPr>
         <w:tc>
           <w:tcPr>
             <w:tcW w:w="0" w:type="auto"/>
-            <w:vAlign w:val="center"/>
             <w:hideMark/>
           </w:tcPr>
           <w:p>
             <w:pPr>
-              <w:rPr>
-                <w:rFonts w:ascii="Times New Roman" w:hAnsi="Times New Roman" w:cs="Times New Roman"/>
-                <w:sz w:val="22"/>
-                <w:szCs w:val="22"/>
+              <w:spacing w:after="160" w:line="278" w:lineRule="auto"/>
+              <w:jc w:val="both"/>
+              <w:rPr>
+                <w:rFonts w:ascii="Times New Roman" w:hAnsi="Times New Roman" w:cs="Times New Roman"/>
               </w:rPr>
             </w:pPr>
             <w:r>
               <w:rPr>
                 <w:rFonts w:ascii="Times New Roman" w:hAnsi="Times New Roman" w:cs="Times New Roman"/>
-                <w:sz w:val="22"/>
-                <w:szCs w:val="22"/>
-              </w:rPr>
-              <w:t>Riesgo</w:t>
+              </w:rPr>
+              <w:t>Dependencia</w:t>
             </w:r>
           </w:p>
         </w:tc>
         <w:tc>
           <w:tcPr>
             <w:tcW w:w="0" w:type="auto"/>
-            <w:vAlign w:val="center"/>
             <w:hideMark/>
           </w:tcPr>
           <w:p>
             <w:pPr>
-              <w:rPr>
-                <w:rFonts w:ascii="Times New Roman" w:hAnsi="Times New Roman" w:cs="Times New Roman"/>
-                <w:sz w:val="22"/>
-                <w:szCs w:val="22"/>
+              <w:spacing w:after="160" w:line="278" w:lineRule="auto"/>
+              <w:jc w:val="both"/>
+              <w:rPr>
+                <w:rFonts w:ascii="Times New Roman" w:hAnsi="Times New Roman" w:cs="Times New Roman"/>
               </w:rPr>
             </w:pPr>
             <w:r>
               <w:rPr>
                 <w:rFonts w:ascii="Times New Roman" w:hAnsi="Times New Roman" w:cs="Times New Roman"/>
-                <w:sz w:val="22"/>
-                <w:szCs w:val="22"/>
-              </w:rPr>
-              <w:t>Los débitos fallidos pueden afectar la continuidad del plan</w:t>
+              </w:rPr>
+              <w:t>La operación de los planes depende de la disponibilidad del Core bancario y del servicio institucional de identidad y acceso.</w:t>
             </w:r>
           </w:p>
         </w:tc>
       </w:tr>
       <w:tr>
-        <w:trPr>
-          <w:tblCellSpacing w:w="15" w:type="dxa"/>
-        </w:trPr>
         <w:tc>
           <w:tcPr>
             <w:tcW w:w="0" w:type="auto"/>
-            <w:vAlign w:val="center"/>
             <w:hideMark/>
           </w:tcPr>
           <w:p>
             <w:pPr>
-              <w:rPr>
-                <w:rFonts w:ascii="Times New Roman" w:hAnsi="Times New Roman" w:cs="Times New Roman"/>
-                <w:sz w:val="22"/>
-                <w:szCs w:val="22"/>
+              <w:spacing w:after="160" w:line="278" w:lineRule="auto"/>
+              <w:jc w:val="both"/>
+              <w:rPr>
+                <w:rFonts w:ascii="Times New Roman" w:hAnsi="Times New Roman" w:cs="Times New Roman"/>
               </w:rPr>
             </w:pPr>
             <w:r>
               <w:rPr>
                 <w:rFonts w:ascii="Times New Roman" w:hAnsi="Times New Roman" w:cs="Times New Roman"/>
-                <w:sz w:val="22"/>
-                <w:szCs w:val="22"/>
-              </w:rPr>
-              <w:t>Riesgo</w:t>
+              </w:rPr>
+              <w:t>Dependencia</w:t>
             </w:r>
           </w:p>
         </w:tc>
         <w:tc>
           <w:tcPr>
             <w:tcW w:w="0" w:type="auto"/>
-            <w:vAlign w:val="center"/>
             <w:hideMark/>
           </w:tcPr>
           <w:p>
             <w:pPr>
-              <w:rPr>
-                <w:rFonts w:ascii="Times New Roman" w:hAnsi="Times New Roman" w:cs="Times New Roman"/>
-                <w:sz w:val="22"/>
-                <w:szCs w:val="22"/>
+              <w:spacing w:after="160" w:line="278" w:lineRule="auto"/>
+              <w:jc w:val="both"/>
+              <w:rPr>
+                <w:rFonts w:ascii="Times New Roman" w:hAnsi="Times New Roman" w:cs="Times New Roman"/>
               </w:rPr>
             </w:pPr>
             <w:r>
               <w:rPr>
                 <w:rFonts w:ascii="Times New Roman" w:hAnsi="Times New Roman" w:cs="Times New Roman"/>
-                <w:sz w:val="22"/>
-                <w:szCs w:val="22"/>
-              </w:rPr>
-              <w:t>Una simulación incorrecta puede crear expectativas financieras equivocadas</w:t>
+              </w:rPr>
+              <w:t>La entrega de avisos depende del servicio institucional de notificaciones, aunque una falla en este servicio no debe impedir el registro de las operaciones del plan.</w:t>
             </w:r>
           </w:p>
         </w:tc>
       </w:tr>
       <w:tr>
-        <w:trPr>
-          <w:tblCellSpacing w:w="15" w:type="dxa"/>
-        </w:trPr>
         <w:tc>
           <w:tcPr>
             <w:tcW w:w="0" w:type="auto"/>
-            <w:vAlign w:val="center"/>
             <w:hideMark/>
           </w:tcPr>
           <w:p>
             <w:pPr>
-              <w:rPr>
-                <w:rFonts w:ascii="Times New Roman" w:hAnsi="Times New Roman" w:cs="Times New Roman"/>
-                <w:sz w:val="22"/>
-                <w:szCs w:val="22"/>
+              <w:spacing w:after="160" w:line="278" w:lineRule="auto"/>
+              <w:jc w:val="both"/>
+              <w:rPr>
+                <w:rFonts w:ascii="Times New Roman" w:hAnsi="Times New Roman" w:cs="Times New Roman"/>
               </w:rPr>
             </w:pPr>
             <w:r>
               <w:rPr>
                 <w:rFonts w:ascii="Times New Roman" w:hAnsi="Times New Roman" w:cs="Times New Roman"/>
-                <w:sz w:val="22"/>
-                <w:szCs w:val="22"/>
-              </w:rPr>
-              <w:t>Restricción</w:t>
+              </w:rPr>
+              <w:t>Riesgo</w:t>
             </w:r>
           </w:p>
         </w:tc>
         <w:tc>
           <w:tcPr>
             <w:tcW w:w="0" w:type="auto"/>
-            <w:vAlign w:val="center"/>
             <w:hideMark/>
           </w:tcPr>
           <w:p>
             <w:pPr>
-              <w:rPr>
-                <w:rFonts w:ascii="Times New Roman" w:hAnsi="Times New Roman" w:cs="Times New Roman"/>
-                <w:sz w:val="22"/>
-                <w:szCs w:val="22"/>
+              <w:spacing w:after="160" w:line="278" w:lineRule="auto"/>
+              <w:jc w:val="both"/>
+              <w:rPr>
+                <w:rFonts w:ascii="Times New Roman" w:hAnsi="Times New Roman" w:cs="Times New Roman"/>
               </w:rPr>
             </w:pPr>
             <w:r>
               <w:rPr>
                 <w:rFonts w:ascii="Times New Roman" w:hAnsi="Times New Roman" w:cs="Times New Roman"/>
-                <w:sz w:val="22"/>
-                <w:szCs w:val="22"/>
-              </w:rPr>
-              <w:t xml:space="preserve">La API no modifica directamente los datos del </w:t>
-            </w:r>
-            <w:r>
-              <w:rPr>
-                <w:rFonts w:ascii="Times New Roman" w:hAnsi="Times New Roman" w:cs="Times New Roman"/>
-                <w:sz w:val="22"/>
-                <w:szCs w:val="22"/>
-              </w:rPr>
-              <w:t>Core</w:t>
+              </w:rPr>
+              <w:t>Los débitos fallidos pueden extender repetidamente el plazo del plan y alejar la fecha estimada para alcanzar la meta.</w:t>
             </w:r>
           </w:p>
         </w:tc>
       </w:tr>
       <w:tr>
-        <w:trPr>
-          <w:tblCellSpacing w:w="15" w:type="dxa"/>
-        </w:trPr>
         <w:tc>
           <w:tcPr>
             <w:tcW w:w="0" w:type="auto"/>
-            <w:vAlign w:val="center"/>
             <w:hideMark/>
           </w:tcPr>
           <w:p>
             <w:pPr>
-              <w:rPr>
-                <w:rFonts w:ascii="Times New Roman" w:hAnsi="Times New Roman" w:cs="Times New Roman"/>
-                <w:sz w:val="22"/>
-                <w:szCs w:val="22"/>
+              <w:spacing w:after="160" w:line="278" w:lineRule="auto"/>
+              <w:jc w:val="both"/>
+              <w:rPr>
+                <w:rFonts w:ascii="Times New Roman" w:hAnsi="Times New Roman" w:cs="Times New Roman"/>
               </w:rPr>
             </w:pPr>
             <w:r>
               <w:rPr>
                 <w:rFonts w:ascii="Times New Roman" w:hAnsi="Times New Roman" w:cs="Times New Roman"/>
-                <w:sz w:val="22"/>
-                <w:szCs w:val="22"/>
-              </w:rPr>
-              <w:t>Restricción</w:t>
+              </w:rPr>
+              <w:t>Riesgo</w:t>
             </w:r>
           </w:p>
         </w:tc>
         <w:tc>
           <w:tcPr>
             <w:tcW w:w="0" w:type="auto"/>
-            <w:vAlign w:val="center"/>
             <w:hideMark/>
           </w:tcPr>
           <w:p>
             <w:pPr>
-              <w:rPr>
-                <w:rFonts w:ascii="Times New Roman" w:hAnsi="Times New Roman" w:cs="Times New Roman"/>
-                <w:sz w:val="22"/>
-                <w:szCs w:val="22"/>
+              <w:spacing w:after="160" w:line="278" w:lineRule="auto"/>
+              <w:jc w:val="both"/>
+              <w:rPr>
+                <w:rFonts w:ascii="Times New Roman" w:hAnsi="Times New Roman" w:cs="Times New Roman"/>
               </w:rPr>
             </w:pPr>
             <w:r>
               <w:rPr>
                 <w:rFonts w:ascii="Times New Roman" w:hAnsi="Times New Roman" w:cs="Times New Roman"/>
-                <w:sz w:val="22"/>
-                <w:szCs w:val="22"/>
-              </w:rPr>
-              <w:t>Las operaciones deben ser seguras, trazables e idempotentes</w:t>
+              </w:rPr>
+              <w:t>Una cuota definida por encima de la capacidad de ahorro del cliente puede provocar fallos recurrentes y afectar la continuidad del plan.</w:t>
+            </w:r>
+          </w:p>
+        </w:tc>
+      </w:tr>
+      <w:tr>
+        <w:tc>
+          <w:tcPr>
+            <w:tcW w:w="0" w:type="auto"/>
+            <w:hideMark/>
+          </w:tcPr>
+          <w:p>
+            <w:pPr>
+              <w:spacing w:after="160" w:line="278" w:lineRule="auto"/>
+              <w:jc w:val="both"/>
+              <w:rPr>
+                <w:rFonts w:ascii="Times New Roman" w:hAnsi="Times New Roman" w:cs="Times New Roman"/>
+              </w:rPr>
+            </w:pPr>
+            <w:r>
+              <w:rPr>
+                <w:rFonts w:ascii="Times New Roman" w:hAnsi="Times New Roman" w:cs="Times New Roman"/>
+              </w:rPr>
+              <w:t>Riesgo</w:t>
+            </w:r>
+          </w:p>
+        </w:tc>
+        <w:tc>
+          <w:tcPr>
+            <w:tcW w:w="0" w:type="auto"/>
+            <w:hideMark/>
+          </w:tcPr>
+          <w:p>
+            <w:pPr>
+              <w:spacing w:after="160" w:line="278" w:lineRule="auto"/>
+              <w:jc w:val="both"/>
+              <w:rPr>
+                <w:rFonts w:ascii="Times New Roman" w:hAnsi="Times New Roman" w:cs="Times New Roman"/>
+              </w:rPr>
+            </w:pPr>
+            <w:r>
+              <w:rPr>
+                <w:rFonts w:ascii="Times New Roman" w:hAnsi="Times New Roman" w:cs="Times New Roman"/>
+              </w:rPr>
+              <w:t>Una simulación basada en tasas o reglas desactualizadas puede generar expectativas incorrectas sobre el monto y los intereses proyectados.</w:t>
+            </w:r>
+          </w:p>
+        </w:tc>
+      </w:tr>
+      <w:tr>
+        <w:tc>
+          <w:tcPr>
+            <w:tcW w:w="0" w:type="auto"/>
+            <w:hideMark/>
+          </w:tcPr>
+          <w:p>
+            <w:pPr>
+              <w:spacing w:after="160" w:line="278" w:lineRule="auto"/>
+              <w:jc w:val="both"/>
+              <w:rPr>
+                <w:rFonts w:ascii="Times New Roman" w:hAnsi="Times New Roman" w:cs="Times New Roman"/>
+              </w:rPr>
+            </w:pPr>
+            <w:r>
+              <w:rPr>
+                <w:rFonts w:ascii="Times New Roman" w:hAnsi="Times New Roman" w:cs="Times New Roman"/>
+              </w:rPr>
+              <w:t>Riesgo</w:t>
+            </w:r>
+          </w:p>
+        </w:tc>
+        <w:tc>
+          <w:tcPr>
+            <w:tcW w:w="0" w:type="auto"/>
+            <w:hideMark/>
+          </w:tcPr>
+          <w:p>
+            <w:pPr>
+              <w:spacing w:after="160" w:line="278" w:lineRule="auto"/>
+              <w:jc w:val="both"/>
+              <w:rPr>
+                <w:rFonts w:ascii="Times New Roman" w:hAnsi="Times New Roman" w:cs="Times New Roman"/>
+              </w:rPr>
+            </w:pPr>
+            <w:r>
+              <w:rPr>
+                <w:rFonts w:ascii="Times New Roman" w:hAnsi="Times New Roman" w:cs="Times New Roman"/>
+              </w:rPr>
+              <w:t>La ausencia de un aporte mínimo puede ocasionar que el costo de procesar determinadas cuotas sea superior al beneficio económico obtenido por el banco.</w:t>
+            </w:r>
+          </w:p>
+        </w:tc>
+      </w:tr>
+      <w:tr>
+        <w:tc>
+          <w:tcPr>
+            <w:tcW w:w="0" w:type="auto"/>
+            <w:hideMark/>
+          </w:tcPr>
+          <w:p>
+            <w:pPr>
+              <w:spacing w:after="160" w:line="278" w:lineRule="auto"/>
+              <w:jc w:val="both"/>
+              <w:rPr>
+                <w:rFonts w:ascii="Times New Roman" w:hAnsi="Times New Roman" w:cs="Times New Roman"/>
+              </w:rPr>
+            </w:pPr>
+            <w:r>
+              <w:rPr>
+                <w:rFonts w:ascii="Times New Roman" w:hAnsi="Times New Roman" w:cs="Times New Roman"/>
+              </w:rPr>
+              <w:t>Riesgo</w:t>
+            </w:r>
+          </w:p>
+        </w:tc>
+        <w:tc>
+          <w:tcPr>
+            <w:tcW w:w="0" w:type="auto"/>
+            <w:hideMark/>
+          </w:tcPr>
+          <w:p>
+            <w:pPr>
+              <w:spacing w:after="160" w:line="278" w:lineRule="auto"/>
+              <w:jc w:val="both"/>
+              <w:rPr>
+                <w:rFonts w:ascii="Times New Roman" w:hAnsi="Times New Roman" w:cs="Times New Roman"/>
+              </w:rPr>
+            </w:pPr>
+            <w:r>
+              <w:rPr>
+                <w:rFonts w:ascii="Times New Roman" w:hAnsi="Times New Roman" w:cs="Times New Roman"/>
+              </w:rPr>
+              <w:t>Una interrupción o respuesta incierta del Core durante un débito puede producir inconsistencias o cobros duplicados si la operación no se controla adecuadamente.</w:t>
+            </w:r>
+          </w:p>
+        </w:tc>
+      </w:tr>
+      <w:tr>
+        <w:tc>
+          <w:tcPr>
+            <w:tcW w:w="0" w:type="auto"/>
+            <w:hideMark/>
+          </w:tcPr>
+          <w:p>
+            <w:pPr>
+              <w:spacing w:after="160" w:line="278" w:lineRule="auto"/>
+              <w:jc w:val="both"/>
+              <w:rPr>
+                <w:rFonts w:ascii="Times New Roman" w:hAnsi="Times New Roman" w:cs="Times New Roman"/>
+              </w:rPr>
+            </w:pPr>
+            <w:r>
+              <w:rPr>
+                <w:rFonts w:ascii="Times New Roman" w:hAnsi="Times New Roman" w:cs="Times New Roman"/>
+              </w:rPr>
+              <w:t>Restricción</w:t>
+            </w:r>
+          </w:p>
+        </w:tc>
+        <w:tc>
+          <w:tcPr>
+            <w:tcW w:w="0" w:type="auto"/>
+            <w:hideMark/>
+          </w:tcPr>
+          <w:p>
+            <w:pPr>
+              <w:spacing w:after="160" w:line="278" w:lineRule="auto"/>
+              <w:jc w:val="both"/>
+              <w:rPr>
+                <w:rFonts w:ascii="Times New Roman" w:hAnsi="Times New Roman" w:cs="Times New Roman"/>
+              </w:rPr>
+            </w:pPr>
+            <w:r>
+              <w:rPr>
+                <w:rFonts w:ascii="Times New Roman" w:hAnsi="Times New Roman" w:cs="Times New Roman"/>
+              </w:rPr>
+              <w:t>La API no accede directamente a la base de datos del Core ni ejecuta movimientos contables por cuenta propia; estas operaciones se solicitan mediante las interfaces autorizadas.</w:t>
+            </w:r>
+          </w:p>
+        </w:tc>
+      </w:tr>
+      <w:tr>
+        <w:tc>
+          <w:tcPr>
+            <w:tcW w:w="0" w:type="auto"/>
+            <w:hideMark/>
+          </w:tcPr>
+          <w:p>
+            <w:pPr>
+              <w:spacing w:after="160" w:line="278" w:lineRule="auto"/>
+              <w:jc w:val="both"/>
+              <w:rPr>
+                <w:rFonts w:ascii="Times New Roman" w:hAnsi="Times New Roman" w:cs="Times New Roman"/>
+              </w:rPr>
+            </w:pPr>
+            <w:r>
+              <w:rPr>
+                <w:rFonts w:ascii="Times New Roman" w:hAnsi="Times New Roman" w:cs="Times New Roman"/>
+              </w:rPr>
+              <w:lastRenderedPageBreak/>
+              <w:t>Restricción</w:t>
+            </w:r>
+          </w:p>
+        </w:tc>
+        <w:tc>
+          <w:tcPr>
+            <w:tcW w:w="0" w:type="auto"/>
+            <w:hideMark/>
+          </w:tcPr>
+          <w:p>
+            <w:pPr>
+              <w:spacing w:after="160" w:line="278" w:lineRule="auto"/>
+              <w:jc w:val="both"/>
+              <w:rPr>
+                <w:rFonts w:ascii="Times New Roman" w:hAnsi="Times New Roman" w:cs="Times New Roman"/>
+              </w:rPr>
+            </w:pPr>
+            <w:r>
+              <w:rPr>
+                <w:rFonts w:ascii="Times New Roman" w:hAnsi="Times New Roman" w:cs="Times New Roman"/>
+              </w:rPr>
+              <w:t>Los débitos fallidos se reintentan cada 24 horas hasta un máximo de cinco intentos. Si el último intento falla, la cuota se cancela y el plazo se extiende un mes, sin acumular deuda ni cobrar dos cuotas juntas.</w:t>
+            </w:r>
+          </w:p>
+        </w:tc>
+      </w:tr>
+      <w:tr>
+        <w:tc>
+          <w:tcPr>
+            <w:tcW w:w="0" w:type="auto"/>
+            <w:hideMark/>
+          </w:tcPr>
+          <w:p>
+            <w:pPr>
+              <w:spacing w:after="160" w:line="278" w:lineRule="auto"/>
+              <w:jc w:val="both"/>
+              <w:rPr>
+                <w:rFonts w:ascii="Times New Roman" w:hAnsi="Times New Roman" w:cs="Times New Roman"/>
+              </w:rPr>
+            </w:pPr>
+            <w:r>
+              <w:rPr>
+                <w:rFonts w:ascii="Times New Roman" w:hAnsi="Times New Roman" w:cs="Times New Roman"/>
+              </w:rPr>
+              <w:t>Restricción</w:t>
+            </w:r>
+          </w:p>
+        </w:tc>
+        <w:tc>
+          <w:tcPr>
+            <w:tcW w:w="0" w:type="auto"/>
+            <w:hideMark/>
+          </w:tcPr>
+          <w:p>
+            <w:pPr>
+              <w:spacing w:after="160" w:line="278" w:lineRule="auto"/>
+              <w:jc w:val="both"/>
+              <w:rPr>
+                <w:rFonts w:ascii="Times New Roman" w:hAnsi="Times New Roman" w:cs="Times New Roman"/>
+              </w:rPr>
+            </w:pPr>
+            <w:r>
+              <w:rPr>
+                <w:rFonts w:ascii="Times New Roman" w:hAnsi="Times New Roman" w:cs="Times New Roman"/>
+              </w:rPr>
+              <w:t>La cancelación de un plan bloqueado implica la pérdida de los intereses generados, mientras que los fondos aportados se devuelven a la cuenta principal.</w:t>
+            </w:r>
+          </w:p>
+        </w:tc>
+      </w:tr>
+      <w:tr>
+        <w:tc>
+          <w:tcPr>
+            <w:tcW w:w="0" w:type="auto"/>
+            <w:hideMark/>
+          </w:tcPr>
+          <w:p>
+            <w:pPr>
+              <w:spacing w:after="160" w:line="278" w:lineRule="auto"/>
+              <w:jc w:val="both"/>
+              <w:rPr>
+                <w:rFonts w:ascii="Times New Roman" w:hAnsi="Times New Roman" w:cs="Times New Roman"/>
+              </w:rPr>
+            </w:pPr>
+            <w:r>
+              <w:rPr>
+                <w:rFonts w:ascii="Times New Roman" w:hAnsi="Times New Roman" w:cs="Times New Roman"/>
+              </w:rPr>
+              <w:t>Restricción</w:t>
+            </w:r>
+          </w:p>
+        </w:tc>
+        <w:tc>
+          <w:tcPr>
+            <w:tcW w:w="0" w:type="auto"/>
+            <w:hideMark/>
+          </w:tcPr>
+          <w:p>
+            <w:pPr>
+              <w:spacing w:after="160" w:line="278" w:lineRule="auto"/>
+              <w:jc w:val="both"/>
+              <w:rPr>
+                <w:rFonts w:ascii="Times New Roman" w:hAnsi="Times New Roman" w:cs="Times New Roman"/>
+              </w:rPr>
+            </w:pPr>
+            <w:r>
+              <w:rPr>
+                <w:rFonts w:ascii="Times New Roman" w:hAnsi="Times New Roman" w:cs="Times New Roman"/>
+              </w:rPr>
+              <w:t>Las operaciones financieras deben mantener seguridad, consistencia, trazabilidad y protección contra el procesamiento duplicado.</w:t>
+            </w:r>
+          </w:p>
+        </w:tc>
+      </w:tr>
+      <w:tr>
+        <w:tc>
+          <w:tcPr>
+            <w:tcW w:w="0" w:type="auto"/>
+            <w:hideMark/>
+          </w:tcPr>
+          <w:p>
+            <w:pPr>
+              <w:spacing w:after="160" w:line="278" w:lineRule="auto"/>
+              <w:jc w:val="both"/>
+              <w:rPr>
+                <w:rFonts w:ascii="Times New Roman" w:hAnsi="Times New Roman" w:cs="Times New Roman"/>
+              </w:rPr>
+            </w:pPr>
+            <w:r>
+              <w:rPr>
+                <w:rFonts w:ascii="Times New Roman" w:hAnsi="Times New Roman" w:cs="Times New Roman"/>
+              </w:rPr>
+              <w:t>Restricción</w:t>
+            </w:r>
+          </w:p>
+        </w:tc>
+        <w:tc>
+          <w:tcPr>
+            <w:tcW w:w="0" w:type="auto"/>
+            <w:hideMark/>
+          </w:tcPr>
+          <w:p>
+            <w:pPr>
+              <w:keepNext/>
+              <w:spacing w:after="160" w:line="278" w:lineRule="auto"/>
+              <w:jc w:val="both"/>
+              <w:rPr>
+                <w:rFonts w:ascii="Times New Roman" w:hAnsi="Times New Roman" w:cs="Times New Roman"/>
+              </w:rPr>
+            </w:pPr>
+            <w:r>
+              <w:rPr>
+                <w:rFonts w:ascii="Times New Roman" w:hAnsi="Times New Roman" w:cs="Times New Roman"/>
+              </w:rPr>
+              <w:t>Los movimientos financieros deben conservarse en un historial inmutable y no pueden eliminarse mediante operaciones de borrado.</w:t>
             </w:r>
           </w:p>
         </w:tc>
       </w:tr>
     </w:tbl>
+    <w:p>
+      <w:pPr>
+        <w:pStyle w:val="Descripcin"/>
+        <w:jc w:val="center"/>
+        <w:rPr>
+          <w:rFonts w:ascii="Times New Roman" w:hAnsi="Times New Roman" w:cs="Times New Roman"/>
+          <w:color w:val="auto"/>
+        </w:rPr>
+      </w:pPr>
+      <w:r>
+        <w:rPr>
+          <w:rFonts w:ascii="Times New Roman" w:hAnsi="Times New Roman" w:cs="Times New Roman"/>
+          <w:color w:val="auto"/>
+        </w:rPr>
+        <w:t xml:space="preserve">Tabla </w:t>
+      </w:r>
+      <w:r>
+        <w:rPr>
+          <w:rFonts w:ascii="Times New Roman" w:hAnsi="Times New Roman" w:cs="Times New Roman"/>
+          <w:color w:val="auto"/>
+        </w:rPr>
+        <w:fldChar w:fldCharType="begin"/>
+      </w:r>
+      <w:r>
+        <w:rPr>
+          <w:rFonts w:ascii="Times New Roman" w:hAnsi="Times New Roman" w:cs="Times New Roman"/>
+          <w:color w:val="auto"/>
+        </w:rPr>
+        <w:instrText xml:space="preserve"> SEQ Tabla \* ARABIC </w:instrText>
+      </w:r>
+      <w:r>
+        <w:rPr>
+          <w:rFonts w:ascii="Times New Roman" w:hAnsi="Times New Roman" w:cs="Times New Roman"/>
+          <w:color w:val="auto"/>
+        </w:rPr>
+        <w:fldChar w:fldCharType="separate"/>
+      </w:r>
+      <w:r>
+        <w:rPr>
+          <w:rFonts w:ascii="Times New Roman" w:hAnsi="Times New Roman" w:cs="Times New Roman"/>
+          <w:noProof/>
+          <w:color w:val="auto"/>
+        </w:rPr>
+        <w:t>8</w:t>
+      </w:r>
+      <w:r>
+        <w:rPr>
+          <w:rFonts w:ascii="Times New Roman" w:hAnsi="Times New Roman" w:cs="Times New Roman"/>
+          <w:color w:val="auto"/>
+        </w:rPr>
+        <w:fldChar w:fldCharType="end"/>
+      </w:r>
+      <w:r>
+        <w:rPr>
+          <w:rFonts w:ascii="Times New Roman" w:hAnsi="Times New Roman" w:cs="Times New Roman"/>
+          <w:color w:val="auto"/>
+        </w:rPr>
+        <w:t>. Riesgos, supuestos y restricciones de la API</w:t>
+      </w:r>
+    </w:p>
+    <w:p>
+      <w:pPr>
+        <w:spacing w:before="240"/>
+        <w:jc w:val="both"/>
+        <w:rPr>
+          <w:rFonts w:ascii="Times New Roman" w:hAnsi="Times New Roman" w:cs="Times New Roman"/>
+        </w:rPr>
+      </w:pPr>
+      <w:r>
+        <w:rPr>
+          <w:rFonts w:ascii="Times New Roman" w:hAnsi="Times New Roman" w:cs="Times New Roman"/>
+        </w:rPr>
+        <w:t>Estos elementos delimitan las condiciones bajo las cuales funcionará la API y permiten identificar aspectos que deberán controlarse durante el diseño, la implementación y la operación del producto.</w:t>
+      </w:r>
+    </w:p>
+    <w:p>
+      <w:pPr>
+        <w:rPr>
+          <w:rFonts w:ascii="Times New Roman" w:hAnsi="Times New Roman" w:cs="Times New Roman"/>
+        </w:rPr>
+      </w:pPr>
+    </w:p>
     <w:p>
       <w:pPr>
         <w:pStyle w:val="Ttulo2"/>
@@ -7399,125 +7861,68 @@
     </w:p>
     <w:p>
       <w:pPr>
+        <w:jc w:val="both"/>
+        <w:rPr>
+          <w:rFonts w:ascii="Times New Roman" w:hAnsi="Times New Roman" w:cs="Times New Roman"/>
+        </w:rPr>
+      </w:pPr>
+      <w:r>
+        <w:rPr>
+          <w:rFonts w:ascii="Times New Roman" w:hAnsi="Times New Roman" w:cs="Times New Roman"/>
+        </w:rPr>
+        <w:t>La API de planes de ahorro responde a la dificultad de establecer objetivos financieros, calcular los aportes necesarios y mantener un seguimiento constante. La simulación, la programación autónoma de aportes y la consulta del progreso permiten organizar el ahorro dentro de los canales digitales que el cliente ya utiliza.</w:t>
+      </w:r>
+    </w:p>
+    <w:p>
+      <w:pPr>
+        <w:jc w:val="both"/>
+        <w:rPr>
+          <w:rFonts w:ascii="Times New Roman" w:hAnsi="Times New Roman" w:cs="Times New Roman"/>
+        </w:rPr>
+      </w:pPr>
+      <w:r>
+        <w:rPr>
+          <w:rFonts w:ascii="Times New Roman" w:hAnsi="Times New Roman" w:cs="Times New Roman"/>
+        </w:rPr>
+        <w:t>La viabilidad del producto se sustenta en su integración con las capacidades existentes del banco. La nueva solución administra el dominio de los planes de ahorro, mientras que el Core y los servicios institucionales conservan la responsabilidad sobre las cuentas, la autentificación, los movimientos contables, el bloqueo de fondos y las notificaciones. Esta distribución evita reconstruir funciones existentes y delimita las responsabilidades de cada componente.</w:t>
+      </w:r>
+    </w:p>
+    <w:p>
+      <w:pPr>
+        <w:jc w:val="both"/>
+        <w:rPr>
+          <w:rFonts w:ascii="Times New Roman" w:hAnsi="Times New Roman" w:cs="Times New Roman"/>
+        </w:rPr>
+      </w:pPr>
+      <w:r>
+        <w:rPr>
+          <w:rFonts w:ascii="Times New Roman" w:hAnsi="Times New Roman" w:cs="Times New Roman"/>
+        </w:rPr>
+        <w:t>Para el banco, el producto permite incrementar la captación recurrente y favorece la permanencia de los fondos. Su monetización es principalmente indirecta, debido a que no se cobra por consumir la API. EL benéfico económico se obtiene mediante la disponibilidad de fondos para la intermediación financiera y, de forma complementaria, por la contratación de productos relacionados.</w:t>
+      </w:r>
+    </w:p>
+    <w:p>
+      <w:pPr>
+        <w:jc w:val="both"/>
+        <w:rPr>
+          <w:rFonts w:ascii="Times New Roman" w:hAnsi="Times New Roman" w:cs="Times New Roman"/>
+        </w:rPr>
+      </w:pPr>
+      <w:r>
+        <w:rPr>
+          <w:rFonts w:ascii="Times New Roman" w:hAnsi="Times New Roman" w:cs="Times New Roman"/>
+        </w:rPr>
+        <w:t>La implementación mediante una API permite separar la lógica de los planes de ahorro del Core bancario y exponerla de forma controlada a la aplicación web, móvil y otros sistemas internos autorizados. Además facilita la integración, evolución y escalabilidad de la funcionalidad sin trasladar a la nueva solución las responsabilidades centrales de la institución.</w:t>
+      </w:r>
+    </w:p>
+    <w:p>
+      <w:pPr>
         <w:rPr>
           <w:rFonts w:ascii="Times New Roman" w:hAnsi="Times New Roman" w:cs="Times New Roman"/>
           <w:sz w:val="22"/>
           <w:szCs w:val="22"/>
         </w:rPr>
       </w:pPr>
-      <w:r>
-        <w:rPr>
-          <w:rFonts w:ascii="Times New Roman" w:hAnsi="Times New Roman" w:cs="Times New Roman"/>
-          <w:sz w:val="22"/>
-          <w:szCs w:val="22"/>
-        </w:rPr>
-        <w:t>La conclusión debe responder brevemente:</w:t>
-      </w:r>
-    </w:p>
-    <w:p>
-      <w:pPr>
-        <w:numPr>
-          <w:ilvl w:val="0"/>
-          <w:numId w:val="20"/>
-        </w:numPr>
-        <w:rPr>
-          <w:rFonts w:ascii="Times New Roman" w:hAnsi="Times New Roman" w:cs="Times New Roman"/>
-          <w:sz w:val="22"/>
-          <w:szCs w:val="22"/>
-        </w:rPr>
-      </w:pPr>
-      <w:r>
-        <w:rPr>
-          <w:rFonts w:ascii="Times New Roman" w:hAnsi="Times New Roman" w:cs="Times New Roman"/>
-          <w:sz w:val="22"/>
-          <w:szCs w:val="22"/>
-        </w:rPr>
-        <w:t>por qué el producto es viable;</w:t>
-      </w:r>
-    </w:p>
-    <w:p>
-      <w:pPr>
-        <w:numPr>
-          <w:ilvl w:val="0"/>
-          <w:numId w:val="20"/>
-        </w:numPr>
-        <w:rPr>
-          <w:rFonts w:ascii="Times New Roman" w:hAnsi="Times New Roman" w:cs="Times New Roman"/>
-          <w:sz w:val="22"/>
-          <w:szCs w:val="22"/>
-        </w:rPr>
-      </w:pPr>
-      <w:r>
-        <w:rPr>
-          <w:rFonts w:ascii="Times New Roman" w:hAnsi="Times New Roman" w:cs="Times New Roman"/>
-          <w:sz w:val="22"/>
-          <w:szCs w:val="22"/>
-        </w:rPr>
-        <w:t>qué problema resuelve;</w:t>
-      </w:r>
-    </w:p>
-    <w:p>
-      <w:pPr>
-        <w:numPr>
-          <w:ilvl w:val="0"/>
-          <w:numId w:val="20"/>
-        </w:numPr>
-        <w:rPr>
-          <w:rFonts w:ascii="Times New Roman" w:hAnsi="Times New Roman" w:cs="Times New Roman"/>
-          <w:sz w:val="22"/>
-          <w:szCs w:val="22"/>
-        </w:rPr>
-      </w:pPr>
-      <w:r>
-        <w:rPr>
-          <w:rFonts w:ascii="Times New Roman" w:hAnsi="Times New Roman" w:cs="Times New Roman"/>
-          <w:sz w:val="22"/>
-          <w:szCs w:val="22"/>
-        </w:rPr>
-        <w:t>cómo beneficia al banco;</w:t>
-      </w:r>
-    </w:p>
-    <w:p>
-      <w:pPr>
-        <w:numPr>
-          <w:ilvl w:val="0"/>
-          <w:numId w:val="20"/>
-        </w:numPr>
-        <w:rPr>
-          <w:rFonts w:ascii="Times New Roman" w:hAnsi="Times New Roman" w:cs="Times New Roman"/>
-          <w:sz w:val="22"/>
-          <w:szCs w:val="22"/>
-        </w:rPr>
-      </w:pPr>
-      <w:r>
-        <w:rPr>
-          <w:rFonts w:ascii="Times New Roman" w:hAnsi="Times New Roman" w:cs="Times New Roman"/>
-          <w:sz w:val="22"/>
-          <w:szCs w:val="22"/>
-        </w:rPr>
-        <w:t>cuál es el modelo de monetización;</w:t>
-      </w:r>
-    </w:p>
-    <w:p>
-      <w:pPr>
-        <w:numPr>
-          <w:ilvl w:val="0"/>
-          <w:numId w:val="20"/>
-        </w:numPr>
-        <w:rPr>
-          <w:rFonts w:ascii="Times New Roman" w:hAnsi="Times New Roman" w:cs="Times New Roman"/>
-          <w:sz w:val="22"/>
-          <w:szCs w:val="22"/>
-        </w:rPr>
-      </w:pPr>
-      <w:r>
-        <w:rPr>
-          <w:rFonts w:ascii="Times New Roman" w:hAnsi="Times New Roman" w:cs="Times New Roman"/>
-          <w:sz w:val="22"/>
-          <w:szCs w:val="22"/>
-        </w:rPr>
-        <w:t>por qué una API resulta adecuada para implementarlo.</w:t>
-      </w:r>
     </w:p>
     <w:p>
       <w:pPr>
@@ -7540,7 +7945,219 @@
           <w:sz w:val="28"/>
           <w:szCs w:val="28"/>
         </w:rPr>
+        <w:lastRenderedPageBreak/>
         <w:t>10. Referencias</w:t>
+      </w:r>
+    </w:p>
+    <w:p>
+      <w:pPr>
+        <w:pStyle w:val="Prrafodelista"/>
+        <w:numPr>
+          <w:ilvl w:val="0"/>
+          <w:numId w:val="48"/>
+        </w:numPr>
+        <w:jc w:val="both"/>
+        <w:rPr>
+          <w:rFonts w:ascii="Times New Roman" w:hAnsi="Times New Roman" w:cs="Times New Roman"/>
+        </w:rPr>
+      </w:pPr>
+      <w:r>
+        <w:rPr>
+          <w:rFonts w:ascii="Times New Roman" w:hAnsi="Times New Roman" w:cs="Times New Roman"/>
+        </w:rPr>
+        <w:t xml:space="preserve">Universidad Politécnica Salesiana. (2026). </w:t>
+      </w:r>
+      <w:r>
+        <w:rPr>
+          <w:rFonts w:ascii="Times New Roman" w:hAnsi="Times New Roman" w:cs="Times New Roman"/>
+          <w:i/>
+          <w:iCs/>
+        </w:rPr>
+        <w:t>Unidad 1: Introducción a las APIs</w:t>
+      </w:r>
+      <w:r>
+        <w:rPr>
+          <w:rFonts w:ascii="Times New Roman" w:hAnsi="Times New Roman" w:cs="Times New Roman"/>
+        </w:rPr>
+        <w:t>. Material académico de la asignatura Arquitectura de APIs.</w:t>
+      </w:r>
+    </w:p>
+    <w:p>
+      <w:pPr>
+        <w:pStyle w:val="Prrafodelista"/>
+        <w:numPr>
+          <w:ilvl w:val="0"/>
+          <w:numId w:val="48"/>
+        </w:numPr>
+        <w:jc w:val="both"/>
+        <w:rPr>
+          <w:rFonts w:ascii="Times New Roman" w:hAnsi="Times New Roman" w:cs="Times New Roman"/>
+        </w:rPr>
+      </w:pPr>
+      <w:r>
+        <w:rPr>
+          <w:rFonts w:ascii="Times New Roman" w:hAnsi="Times New Roman" w:cs="Times New Roman"/>
+          <w:lang w:val="de-DE"/>
+        </w:rPr>
+        <w:t xml:space="preserve">The Open Group. (2022). </w:t>
+      </w:r>
+      <w:r>
+        <w:rPr>
+          <w:rFonts w:ascii="Times New Roman" w:hAnsi="Times New Roman" w:cs="Times New Roman"/>
+          <w:i/>
+          <w:iCs/>
+          <w:lang w:val="de-DE"/>
+        </w:rPr>
+        <w:t>ArchiMate 3.2 Specification</w:t>
+      </w:r>
+      <w:r>
+        <w:rPr>
+          <w:rFonts w:ascii="Times New Roman" w:hAnsi="Times New Roman" w:cs="Times New Roman"/>
+          <w:lang w:val="de-DE"/>
+        </w:rPr>
+        <w:t xml:space="preserve">. </w:t>
+      </w:r>
+      <w:r>
+        <w:rPr>
+          <w:rFonts w:ascii="Times New Roman" w:hAnsi="Times New Roman" w:cs="Times New Roman"/>
+        </w:rPr>
+        <w:t>The Open Group.</w:t>
+      </w:r>
+    </w:p>
+    <w:p>
+      <w:pPr>
+        <w:pStyle w:val="Prrafodelista"/>
+        <w:numPr>
+          <w:ilvl w:val="0"/>
+          <w:numId w:val="48"/>
+        </w:numPr>
+        <w:jc w:val="both"/>
+        <w:rPr>
+          <w:rFonts w:ascii="Times New Roman" w:hAnsi="Times New Roman" w:cs="Times New Roman"/>
+        </w:rPr>
+      </w:pPr>
+      <w:r>
+        <w:rPr>
+          <w:rFonts w:ascii="Times New Roman" w:hAnsi="Times New Roman" w:cs="Times New Roman"/>
+        </w:rPr>
+        <w:t xml:space="preserve">OpenAPI Initiative. (s. f.). </w:t>
+      </w:r>
+      <w:r>
+        <w:rPr>
+          <w:rFonts w:ascii="Times New Roman" w:hAnsi="Times New Roman" w:cs="Times New Roman"/>
+          <w:i/>
+          <w:iCs/>
+        </w:rPr>
+        <w:t>OpenAPI Specification, versión 3.1</w:t>
+      </w:r>
+      <w:r>
+        <w:rPr>
+          <w:rFonts w:ascii="Times New Roman" w:hAnsi="Times New Roman" w:cs="Times New Roman"/>
+        </w:rPr>
+        <w:t>.</w:t>
+      </w:r>
+    </w:p>
+    <w:p>
+      <w:pPr>
+        <w:pStyle w:val="Prrafodelista"/>
+        <w:numPr>
+          <w:ilvl w:val="0"/>
+          <w:numId w:val="48"/>
+        </w:numPr>
+        <w:jc w:val="both"/>
+        <w:rPr>
+          <w:rFonts w:ascii="Times New Roman" w:hAnsi="Times New Roman" w:cs="Times New Roman"/>
+          <w:lang w:val="de-DE"/>
+        </w:rPr>
+      </w:pPr>
+      <w:r>
+        <w:rPr>
+          <w:rFonts w:ascii="Times New Roman" w:hAnsi="Times New Roman" w:cs="Times New Roman"/>
+          <w:lang w:val="de-DE"/>
+        </w:rPr>
+        <w:t xml:space="preserve">Hardt, D. (2012). </w:t>
+      </w:r>
+      <w:r>
+        <w:rPr>
+          <w:rFonts w:ascii="Times New Roman" w:hAnsi="Times New Roman" w:cs="Times New Roman"/>
+          <w:i/>
+          <w:iCs/>
+          <w:lang w:val="de-DE"/>
+        </w:rPr>
+        <w:t>The OAuth 2.0 Authorization Framework</w:t>
+      </w:r>
+      <w:r>
+        <w:rPr>
+          <w:rFonts w:ascii="Times New Roman" w:hAnsi="Times New Roman" w:cs="Times New Roman"/>
+          <w:lang w:val="de-DE"/>
+        </w:rPr>
+        <w:t>. RFC 6749. Internet Engineering Task Force.</w:t>
+      </w:r>
+    </w:p>
+    <w:p>
+      <w:pPr>
+        <w:pStyle w:val="Prrafodelista"/>
+        <w:numPr>
+          <w:ilvl w:val="0"/>
+          <w:numId w:val="48"/>
+        </w:numPr>
+        <w:jc w:val="both"/>
+        <w:rPr>
+          <w:rFonts w:ascii="Times New Roman" w:hAnsi="Times New Roman" w:cs="Times New Roman"/>
+        </w:rPr>
+      </w:pPr>
+      <w:r>
+        <w:rPr>
+          <w:rFonts w:ascii="Times New Roman" w:hAnsi="Times New Roman" w:cs="Times New Roman"/>
+        </w:rPr>
+        <w:t xml:space="preserve">Equipo del proyecto. (2026). </w:t>
+      </w:r>
+      <w:r>
+        <w:rPr>
+          <w:rFonts w:ascii="Times New Roman" w:hAnsi="Times New Roman" w:cs="Times New Roman"/>
+          <w:i/>
+          <w:iCs/>
+        </w:rPr>
+        <w:t>Visión y negocio de la billetera de ahorro</w:t>
+      </w:r>
+      <w:r>
+        <w:rPr>
+          <w:rFonts w:ascii="Times New Roman" w:hAnsi="Times New Roman" w:cs="Times New Roman"/>
+        </w:rPr>
+        <w:t>. Documento interno.</w:t>
+      </w:r>
+    </w:p>
+    <w:p>
+      <w:pPr>
+        <w:pStyle w:val="Prrafodelista"/>
+        <w:numPr>
+          <w:ilvl w:val="0"/>
+          <w:numId w:val="48"/>
+        </w:numPr>
+        <w:jc w:val="both"/>
+        <w:rPr>
+          <w:rFonts w:ascii="Times New Roman" w:hAnsi="Times New Roman" w:cs="Times New Roman"/>
+        </w:rPr>
+      </w:pPr>
+      <w:r>
+        <w:rPr>
+          <w:rFonts w:ascii="Times New Roman" w:hAnsi="Times New Roman" w:cs="Times New Roman"/>
+        </w:rPr>
+        <w:t xml:space="preserve">Equipo del proyecto. (2026). </w:t>
+      </w:r>
+      <w:r>
+        <w:rPr>
+          <w:rFonts w:ascii="Times New Roman" w:hAnsi="Times New Roman" w:cs="Times New Roman"/>
+          <w:i/>
+          <w:iCs/>
+        </w:rPr>
+        <w:t>Requerimientos de la billetera de ahorro</w:t>
+      </w:r>
+      <w:r>
+        <w:rPr>
+          <w:rFonts w:ascii="Times New Roman" w:hAnsi="Times New Roman" w:cs="Times New Roman"/>
+        </w:rPr>
+        <w:t>. Documento interno.</w:t>
       </w:r>
     </w:p>
     <w:sectPr>
@@ -7678,6 +8295,268 @@
     </w:lvl>
   </w:abstractNum>
   <w:abstractNum w:abstractNumId="1" w15:restartNumberingAfterBreak="0">
+    <w:nsid w:val="001C500B"/>
+    <w:multiLevelType w:val="multilevel"/>
+    <w:tmpl w:val="EA1CBCAC"/>
+    <w:lvl w:ilvl="0">
+      <w:start w:val="1"/>
+      <w:numFmt w:val="bullet"/>
+      <w:lvlText w:val=""/>
+      <w:lvlJc w:val="left"/>
+      <w:pPr>
+        <w:tabs>
+          <w:tab w:val="num" w:pos="720"/>
+        </w:tabs>
+        <w:ind w:left="720" w:hanging="360"/>
+      </w:pPr>
+      <w:rPr>
+        <w:rFonts w:ascii="Symbol" w:hAnsi="Symbol" w:hint="default"/>
+        <w:sz w:val="20"/>
+      </w:rPr>
+    </w:lvl>
+    <w:lvl w:ilvl="1" w:tentative="1">
+      <w:start w:val="1"/>
+      <w:numFmt w:val="bullet"/>
+      <w:lvlText w:val="o"/>
+      <w:lvlJc w:val="left"/>
+      <w:pPr>
+        <w:tabs>
+          <w:tab w:val="num" w:pos="1440"/>
+        </w:tabs>
+        <w:ind w:left="1440" w:hanging="360"/>
+      </w:pPr>
+      <w:rPr>
+        <w:rFonts w:ascii="Courier New" w:hAnsi="Courier New" w:hint="default"/>
+        <w:sz w:val="20"/>
+      </w:rPr>
+    </w:lvl>
+    <w:lvl w:ilvl="2" w:tentative="1">
+      <w:start w:val="1"/>
+      <w:numFmt w:val="bullet"/>
+      <w:lvlText w:val=""/>
+      <w:lvlJc w:val="left"/>
+      <w:pPr>
+        <w:tabs>
+          <w:tab w:val="num" w:pos="2160"/>
+        </w:tabs>
+        <w:ind w:left="2160" w:hanging="360"/>
+      </w:pPr>
+      <w:rPr>
+        <w:rFonts w:ascii="Wingdings" w:hAnsi="Wingdings" w:hint="default"/>
+        <w:sz w:val="20"/>
+      </w:rPr>
+    </w:lvl>
+    <w:lvl w:ilvl="3" w:tentative="1">
+      <w:start w:val="1"/>
+      <w:numFmt w:val="bullet"/>
+      <w:lvlText w:val=""/>
+      <w:lvlJc w:val="left"/>
+      <w:pPr>
+        <w:tabs>
+          <w:tab w:val="num" w:pos="2880"/>
+        </w:tabs>
+        <w:ind w:left="2880" w:hanging="360"/>
+      </w:pPr>
+      <w:rPr>
+        <w:rFonts w:ascii="Wingdings" w:hAnsi="Wingdings" w:hint="default"/>
+        <w:sz w:val="20"/>
+      </w:rPr>
+    </w:lvl>
+    <w:lvl w:ilvl="4" w:tentative="1">
+      <w:start w:val="1"/>
+      <w:numFmt w:val="bullet"/>
+      <w:lvlText w:val=""/>
+      <w:lvlJc w:val="left"/>
+      <w:pPr>
+        <w:tabs>
+          <w:tab w:val="num" w:pos="3600"/>
+        </w:tabs>
+        <w:ind w:left="3600" w:hanging="360"/>
+      </w:pPr>
+      <w:rPr>
+        <w:rFonts w:ascii="Wingdings" w:hAnsi="Wingdings" w:hint="default"/>
+        <w:sz w:val="20"/>
+      </w:rPr>
+    </w:lvl>
+    <w:lvl w:ilvl="5" w:tentative="1">
+      <w:start w:val="1"/>
+      <w:numFmt w:val="bullet"/>
+      <w:lvlText w:val=""/>
+      <w:lvlJc w:val="left"/>
+      <w:pPr>
+        <w:tabs>
+          <w:tab w:val="num" w:pos="4320"/>
+        </w:tabs>
+        <w:ind w:left="4320" w:hanging="360"/>
+      </w:pPr>
+      <w:rPr>
+        <w:rFonts w:ascii="Wingdings" w:hAnsi="Wingdings" w:hint="default"/>
+        <w:sz w:val="20"/>
+      </w:rPr>
+    </w:lvl>
+    <w:lvl w:ilvl="6" w:tentative="1">
+      <w:start w:val="1"/>
+      <w:numFmt w:val="bullet"/>
+      <w:lvlText w:val=""/>
+      <w:lvlJc w:val="left"/>
+      <w:pPr>
+        <w:tabs>
+          <w:tab w:val="num" w:pos="5040"/>
+        </w:tabs>
+        <w:ind w:left="5040" w:hanging="360"/>
+      </w:pPr>
+      <w:rPr>
+        <w:rFonts w:ascii="Wingdings" w:hAnsi="Wingdings" w:hint="default"/>
+        <w:sz w:val="20"/>
+      </w:rPr>
+    </w:lvl>
+    <w:lvl w:ilvl="7" w:tentative="1">
+      <w:start w:val="1"/>
+      <w:numFmt w:val="bullet"/>
+      <w:lvlText w:val=""/>
+      <w:lvlJc w:val="left"/>
+      <w:pPr>
+        <w:tabs>
+          <w:tab w:val="num" w:pos="5760"/>
+        </w:tabs>
+        <w:ind w:left="5760" w:hanging="360"/>
+      </w:pPr>
+      <w:rPr>
+        <w:rFonts w:ascii="Wingdings" w:hAnsi="Wingdings" w:hint="default"/>
+        <w:sz w:val="20"/>
+      </w:rPr>
+    </w:lvl>
+    <w:lvl w:ilvl="8" w:tentative="1">
+      <w:start w:val="1"/>
+      <w:numFmt w:val="bullet"/>
+      <w:lvlText w:val=""/>
+      <w:lvlJc w:val="left"/>
+      <w:pPr>
+        <w:tabs>
+          <w:tab w:val="num" w:pos="6480"/>
+        </w:tabs>
+        <w:ind w:left="6480" w:hanging="360"/>
+      </w:pPr>
+      <w:rPr>
+        <w:rFonts w:ascii="Wingdings" w:hAnsi="Wingdings" w:hint="default"/>
+        <w:sz w:val="20"/>
+      </w:rPr>
+    </w:lvl>
+  </w:abstractNum>
+  <w:abstractNum w:abstractNumId="2" w15:restartNumberingAfterBreak="0">
+    <w:nsid w:val="01C465CD"/>
+    <w:multiLevelType w:val="hybridMultilevel"/>
+    <w:tmpl w:val="6706B88C"/>
+    <w:lvl w:ilvl="0" w:tplc="300A0001">
+      <w:start w:val="1"/>
+      <w:numFmt w:val="bullet"/>
+      <w:lvlText w:val=""/>
+      <w:lvlJc w:val="left"/>
+      <w:pPr>
+        <w:ind w:left="720" w:hanging="360"/>
+      </w:pPr>
+      <w:rPr>
+        <w:rFonts w:ascii="Symbol" w:hAnsi="Symbol" w:hint="default"/>
+      </w:rPr>
+    </w:lvl>
+    <w:lvl w:ilvl="1" w:tplc="300A0003" w:tentative="1">
+      <w:start w:val="1"/>
+      <w:numFmt w:val="bullet"/>
+      <w:lvlText w:val="o"/>
+      <w:lvlJc w:val="left"/>
+      <w:pPr>
+        <w:ind w:left="1440" w:hanging="360"/>
+      </w:pPr>
+      <w:rPr>
+        <w:rFonts w:ascii="Courier New" w:hAnsi="Courier New" w:cs="Courier New" w:hint="default"/>
+      </w:rPr>
+    </w:lvl>
+    <w:lvl w:ilvl="2" w:tplc="300A0005" w:tentative="1">
+      <w:start w:val="1"/>
+      <w:numFmt w:val="bullet"/>
+      <w:lvlText w:val=""/>
+      <w:lvlJc w:val="left"/>
+      <w:pPr>
+        <w:ind w:left="2160" w:hanging="360"/>
+      </w:pPr>
+      <w:rPr>
+        <w:rFonts w:ascii="Wingdings" w:hAnsi="Wingdings" w:hint="default"/>
+      </w:rPr>
+    </w:lvl>
+    <w:lvl w:ilvl="3" w:tplc="300A0001" w:tentative="1">
+      <w:start w:val="1"/>
+      <w:numFmt w:val="bullet"/>
+      <w:lvlText w:val=""/>
+      <w:lvlJc w:val="left"/>
+      <w:pPr>
+        <w:ind w:left="2880" w:hanging="360"/>
+      </w:pPr>
+      <w:rPr>
+        <w:rFonts w:ascii="Symbol" w:hAnsi="Symbol" w:hint="default"/>
+      </w:rPr>
+    </w:lvl>
+    <w:lvl w:ilvl="4" w:tplc="300A0003" w:tentative="1">
+      <w:start w:val="1"/>
+      <w:numFmt w:val="bullet"/>
+      <w:lvlText w:val="o"/>
+      <w:lvlJc w:val="left"/>
+      <w:pPr>
+        <w:ind w:left="3600" w:hanging="360"/>
+      </w:pPr>
+      <w:rPr>
+        <w:rFonts w:ascii="Courier New" w:hAnsi="Courier New" w:cs="Courier New" w:hint="default"/>
+      </w:rPr>
+    </w:lvl>
+    <w:lvl w:ilvl="5" w:tplc="300A0005" w:tentative="1">
+      <w:start w:val="1"/>
+      <w:numFmt w:val="bullet"/>
+      <w:lvlText w:val=""/>
+      <w:lvlJc w:val="left"/>
+      <w:pPr>
+        <w:ind w:left="4320" w:hanging="360"/>
+      </w:pPr>
+      <w:rPr>
+        <w:rFonts w:ascii="Wingdings" w:hAnsi="Wingdings" w:hint="default"/>
+      </w:rPr>
+    </w:lvl>
+    <w:lvl w:ilvl="6" w:tplc="300A0001" w:tentative="1">
+      <w:start w:val="1"/>
+      <w:numFmt w:val="bullet"/>
+      <w:lvlText w:val=""/>
+      <w:lvlJc w:val="left"/>
+      <w:pPr>
+        <w:ind w:left="5040" w:hanging="360"/>
+      </w:pPr>
+      <w:rPr>
+        <w:rFonts w:ascii="Symbol" w:hAnsi="Symbol" w:hint="default"/>
+      </w:rPr>
+    </w:lvl>
+    <w:lvl w:ilvl="7" w:tplc="300A0003" w:tentative="1">
+      <w:start w:val="1"/>
+      <w:numFmt w:val="bullet"/>
+      <w:lvlText w:val="o"/>
+      <w:lvlJc w:val="left"/>
+      <w:pPr>
+        <w:ind w:left="5760" w:hanging="360"/>
+      </w:pPr>
+      <w:rPr>
+        <w:rFonts w:ascii="Courier New" w:hAnsi="Courier New" w:cs="Courier New" w:hint="default"/>
+      </w:rPr>
+    </w:lvl>
+    <w:lvl w:ilvl="8" w:tplc="300A0005" w:tentative="1">
+      <w:start w:val="1"/>
+      <w:numFmt w:val="bullet"/>
+      <w:lvlText w:val=""/>
+      <w:lvlJc w:val="left"/>
+      <w:pPr>
+        <w:ind w:left="6480" w:hanging="360"/>
+      </w:pPr>
+      <w:rPr>
+        <w:rFonts w:ascii="Wingdings" w:hAnsi="Wingdings" w:hint="default"/>
+      </w:rPr>
+    </w:lvl>
+  </w:abstractNum>
+  <w:abstractNum w:abstractNumId="3" w15:restartNumberingAfterBreak="0">
     <w:nsid w:val="01CD4DEB"/>
     <w:multiLevelType w:val="hybridMultilevel"/>
     <w:tmpl w:val="D1E6EACA"/>
@@ -7790,7 +8669,7 @@
       </w:rPr>
     </w:lvl>
   </w:abstractNum>
-  <w:abstractNum w:abstractNumId="2" w15:restartNumberingAfterBreak="0">
+  <w:abstractNum w:abstractNumId="4" w15:restartNumberingAfterBreak="0">
     <w:nsid w:val="03806976"/>
     <w:multiLevelType w:val="multilevel"/>
     <w:tmpl w:val="67A8F5CE"/>
@@ -7903,7 +8782,7 @@
       </w:rPr>
     </w:lvl>
   </w:abstractNum>
-  <w:abstractNum w:abstractNumId="3" w15:restartNumberingAfterBreak="0">
+  <w:abstractNum w:abstractNumId="5" w15:restartNumberingAfterBreak="0">
     <w:nsid w:val="04DE6868"/>
     <w:multiLevelType w:val="hybridMultilevel"/>
     <w:tmpl w:val="724C3ACA"/>
@@ -8016,7 +8895,7 @@
       </w:rPr>
     </w:lvl>
   </w:abstractNum>
-  <w:abstractNum w:abstractNumId="4" w15:restartNumberingAfterBreak="0">
+  <w:abstractNum w:abstractNumId="6" w15:restartNumberingAfterBreak="0">
     <w:nsid w:val="05A535E3"/>
     <w:multiLevelType w:val="hybridMultilevel"/>
     <w:tmpl w:val="1AA6BA08"/>
@@ -8129,7 +9008,7 @@
       </w:rPr>
     </w:lvl>
   </w:abstractNum>
-  <w:abstractNum w:abstractNumId="5" w15:restartNumberingAfterBreak="0">
+  <w:abstractNum w:abstractNumId="7" w15:restartNumberingAfterBreak="0">
     <w:nsid w:val="0AC42EE2"/>
     <w:multiLevelType w:val="hybridMultilevel"/>
     <w:tmpl w:val="C33A4044"/>
@@ -8242,7 +9121,7 @@
       </w:rPr>
     </w:lvl>
   </w:abstractNum>
-  <w:abstractNum w:abstractNumId="6" w15:restartNumberingAfterBreak="0">
+  <w:abstractNum w:abstractNumId="8" w15:restartNumberingAfterBreak="0">
     <w:nsid w:val="0C973C29"/>
     <w:multiLevelType w:val="hybridMultilevel"/>
     <w:tmpl w:val="7250F2CA"/>
@@ -8355,7 +9234,7 @@
       </w:rPr>
     </w:lvl>
   </w:abstractNum>
-  <w:abstractNum w:abstractNumId="7" w15:restartNumberingAfterBreak="0">
+  <w:abstractNum w:abstractNumId="9" w15:restartNumberingAfterBreak="0">
     <w:nsid w:val="0FC24043"/>
     <w:multiLevelType w:val="hybridMultilevel"/>
     <w:tmpl w:val="2976200A"/>
@@ -8468,7 +9347,120 @@
       </w:rPr>
     </w:lvl>
   </w:abstractNum>
-  <w:abstractNum w:abstractNumId="8" w15:restartNumberingAfterBreak="0">
+  <w:abstractNum w:abstractNumId="10" w15:restartNumberingAfterBreak="0">
+    <w:nsid w:val="12B14FC0"/>
+    <w:multiLevelType w:val="hybridMultilevel"/>
+    <w:tmpl w:val="825C693A"/>
+    <w:lvl w:ilvl="0" w:tplc="300A0001">
+      <w:start w:val="1"/>
+      <w:numFmt w:val="bullet"/>
+      <w:lvlText w:val=""/>
+      <w:lvlJc w:val="left"/>
+      <w:pPr>
+        <w:ind w:left="720" w:hanging="360"/>
+      </w:pPr>
+      <w:rPr>
+        <w:rFonts w:ascii="Symbol" w:hAnsi="Symbol" w:hint="default"/>
+      </w:rPr>
+    </w:lvl>
+    <w:lvl w:ilvl="1" w:tplc="300A0003" w:tentative="1">
+      <w:start w:val="1"/>
+      <w:numFmt w:val="bullet"/>
+      <w:lvlText w:val="o"/>
+      <w:lvlJc w:val="left"/>
+      <w:pPr>
+        <w:ind w:left="1440" w:hanging="360"/>
+      </w:pPr>
+      <w:rPr>
+        <w:rFonts w:ascii="Courier New" w:hAnsi="Courier New" w:cs="Courier New" w:hint="default"/>
+      </w:rPr>
+    </w:lvl>
+    <w:lvl w:ilvl="2" w:tplc="300A0005" w:tentative="1">
+      <w:start w:val="1"/>
+      <w:numFmt w:val="bullet"/>
+      <w:lvlText w:val=""/>
+      <w:lvlJc w:val="left"/>
+      <w:pPr>
+        <w:ind w:left="2160" w:hanging="360"/>
+      </w:pPr>
+      <w:rPr>
+        <w:rFonts w:ascii="Wingdings" w:hAnsi="Wingdings" w:hint="default"/>
+      </w:rPr>
+    </w:lvl>
+    <w:lvl w:ilvl="3" w:tplc="300A0001" w:tentative="1">
+      <w:start w:val="1"/>
+      <w:numFmt w:val="bullet"/>
+      <w:lvlText w:val=""/>
+      <w:lvlJc w:val="left"/>
+      <w:pPr>
+        <w:ind w:left="2880" w:hanging="360"/>
+      </w:pPr>
+      <w:rPr>
+        <w:rFonts w:ascii="Symbol" w:hAnsi="Symbol" w:hint="default"/>
+      </w:rPr>
+    </w:lvl>
+    <w:lvl w:ilvl="4" w:tplc="300A0003" w:tentative="1">
+      <w:start w:val="1"/>
+      <w:numFmt w:val="bullet"/>
+      <w:lvlText w:val="o"/>
+      <w:lvlJc w:val="left"/>
+      <w:pPr>
+        <w:ind w:left="3600" w:hanging="360"/>
+      </w:pPr>
+      <w:rPr>
+        <w:rFonts w:ascii="Courier New" w:hAnsi="Courier New" w:cs="Courier New" w:hint="default"/>
+      </w:rPr>
+    </w:lvl>
+    <w:lvl w:ilvl="5" w:tplc="300A0005" w:tentative="1">
+      <w:start w:val="1"/>
+      <w:numFmt w:val="bullet"/>
+      <w:lvlText w:val=""/>
+      <w:lvlJc w:val="left"/>
+      <w:pPr>
+        <w:ind w:left="4320" w:hanging="360"/>
+      </w:pPr>
+      <w:rPr>
+        <w:rFonts w:ascii="Wingdings" w:hAnsi="Wingdings" w:hint="default"/>
+      </w:rPr>
+    </w:lvl>
+    <w:lvl w:ilvl="6" w:tplc="300A0001" w:tentative="1">
+      <w:start w:val="1"/>
+      <w:numFmt w:val="bullet"/>
+      <w:lvlText w:val=""/>
+      <w:lvlJc w:val="left"/>
+      <w:pPr>
+        <w:ind w:left="5040" w:hanging="360"/>
+      </w:pPr>
+      <w:rPr>
+        <w:rFonts w:ascii="Symbol" w:hAnsi="Symbol" w:hint="default"/>
+      </w:rPr>
+    </w:lvl>
+    <w:lvl w:ilvl="7" w:tplc="300A0003" w:tentative="1">
+      <w:start w:val="1"/>
+      <w:numFmt w:val="bullet"/>
+      <w:lvlText w:val="o"/>
+      <w:lvlJc w:val="left"/>
+      <w:pPr>
+        <w:ind w:left="5760" w:hanging="360"/>
+      </w:pPr>
+      <w:rPr>
+        <w:rFonts w:ascii="Courier New" w:hAnsi="Courier New" w:cs="Courier New" w:hint="default"/>
+      </w:rPr>
+    </w:lvl>
+    <w:lvl w:ilvl="8" w:tplc="300A0005" w:tentative="1">
+      <w:start w:val="1"/>
+      <w:numFmt w:val="bullet"/>
+      <w:lvlText w:val=""/>
+      <w:lvlJc w:val="left"/>
+      <w:pPr>
+        <w:ind w:left="6480" w:hanging="360"/>
+      </w:pPr>
+      <w:rPr>
+        <w:rFonts w:ascii="Wingdings" w:hAnsi="Wingdings" w:hint="default"/>
+      </w:rPr>
+    </w:lvl>
+  </w:abstractNum>
+  <w:abstractNum w:abstractNumId="11" w15:restartNumberingAfterBreak="0">
     <w:nsid w:val="15977EA7"/>
     <w:multiLevelType w:val="multilevel"/>
     <w:tmpl w:val="2436AB26"/>
@@ -8617,7 +9609,7 @@
       </w:rPr>
     </w:lvl>
   </w:abstractNum>
-  <w:abstractNum w:abstractNumId="9" w15:restartNumberingAfterBreak="0">
+  <w:abstractNum w:abstractNumId="12" w15:restartNumberingAfterBreak="0">
     <w:nsid w:val="17827996"/>
     <w:multiLevelType w:val="hybridMultilevel"/>
     <w:tmpl w:val="DECA7528"/>
@@ -8706,7 +9698,7 @@
       </w:pPr>
     </w:lvl>
   </w:abstractNum>
-  <w:abstractNum w:abstractNumId="10" w15:restartNumberingAfterBreak="0">
+  <w:abstractNum w:abstractNumId="13" w15:restartNumberingAfterBreak="0">
     <w:nsid w:val="17D20D30"/>
     <w:multiLevelType w:val="multilevel"/>
     <w:tmpl w:val="3D509930"/>
@@ -8855,7 +9847,7 @@
       </w:rPr>
     </w:lvl>
   </w:abstractNum>
-  <w:abstractNum w:abstractNumId="11" w15:restartNumberingAfterBreak="0">
+  <w:abstractNum w:abstractNumId="14" w15:restartNumberingAfterBreak="0">
     <w:nsid w:val="1A7E1CAD"/>
     <w:multiLevelType w:val="hybridMultilevel"/>
     <w:tmpl w:val="C31ED4EA"/>
@@ -8968,7 +9960,7 @@
       </w:rPr>
     </w:lvl>
   </w:abstractNum>
-  <w:abstractNum w:abstractNumId="12" w15:restartNumberingAfterBreak="0">
+  <w:abstractNum w:abstractNumId="15" w15:restartNumberingAfterBreak="0">
     <w:nsid w:val="1BAD045F"/>
     <w:multiLevelType w:val="multilevel"/>
     <w:tmpl w:val="B09C02F2"/>
@@ -9090,7 +10082,7 @@
       </w:rPr>
     </w:lvl>
   </w:abstractNum>
-  <w:abstractNum w:abstractNumId="13" w15:restartNumberingAfterBreak="0">
+  <w:abstractNum w:abstractNumId="16" w15:restartNumberingAfterBreak="0">
     <w:nsid w:val="1D405065"/>
     <w:multiLevelType w:val="hybridMultilevel"/>
     <w:tmpl w:val="16564EEC"/>
@@ -9203,7 +10195,7 @@
       </w:rPr>
     </w:lvl>
   </w:abstractNum>
-  <w:abstractNum w:abstractNumId="14" w15:restartNumberingAfterBreak="0">
+  <w:abstractNum w:abstractNumId="17" w15:restartNumberingAfterBreak="0">
     <w:nsid w:val="1F8269FD"/>
     <w:multiLevelType w:val="multilevel"/>
     <w:tmpl w:val="9D380F4E"/>
@@ -9352,7 +10344,7 @@
       </w:rPr>
     </w:lvl>
   </w:abstractNum>
-  <w:abstractNum w:abstractNumId="15" w15:restartNumberingAfterBreak="0">
+  <w:abstractNum w:abstractNumId="18" w15:restartNumberingAfterBreak="0">
     <w:nsid w:val="229D23E6"/>
     <w:multiLevelType w:val="multilevel"/>
     <w:tmpl w:val="BF604106"/>
@@ -9501,7 +10493,7 @@
       </w:rPr>
     </w:lvl>
   </w:abstractNum>
-  <w:abstractNum w:abstractNumId="16" w15:restartNumberingAfterBreak="0">
+  <w:abstractNum w:abstractNumId="19" w15:restartNumberingAfterBreak="0">
     <w:nsid w:val="269E3CC5"/>
     <w:multiLevelType w:val="multilevel"/>
     <w:tmpl w:val="3092B7C8"/>
@@ -9650,7 +10642,7 @@
       </w:rPr>
     </w:lvl>
   </w:abstractNum>
-  <w:abstractNum w:abstractNumId="17" w15:restartNumberingAfterBreak="0">
+  <w:abstractNum w:abstractNumId="20" w15:restartNumberingAfterBreak="0">
     <w:nsid w:val="283F3B33"/>
     <w:multiLevelType w:val="hybridMultilevel"/>
     <w:tmpl w:val="B9EE6F76"/>
@@ -9763,7 +10755,7 @@
       </w:rPr>
     </w:lvl>
   </w:abstractNum>
-  <w:abstractNum w:abstractNumId="18" w15:restartNumberingAfterBreak="0">
+  <w:abstractNum w:abstractNumId="21" w15:restartNumberingAfterBreak="0">
     <w:nsid w:val="287307A0"/>
     <w:multiLevelType w:val="multilevel"/>
     <w:tmpl w:val="884417AE"/>
@@ -9912,7 +10904,7 @@
       </w:rPr>
     </w:lvl>
   </w:abstractNum>
-  <w:abstractNum w:abstractNumId="19" w15:restartNumberingAfterBreak="0">
+  <w:abstractNum w:abstractNumId="22" w15:restartNumberingAfterBreak="0">
     <w:nsid w:val="29DB7AFE"/>
     <w:multiLevelType w:val="multilevel"/>
     <w:tmpl w:val="6A2CBC38"/>
@@ -10061,7 +11053,7 @@
       </w:rPr>
     </w:lvl>
   </w:abstractNum>
-  <w:abstractNum w:abstractNumId="20" w15:restartNumberingAfterBreak="0">
+  <w:abstractNum w:abstractNumId="23" w15:restartNumberingAfterBreak="0">
     <w:nsid w:val="2BB902A1"/>
     <w:multiLevelType w:val="multilevel"/>
     <w:tmpl w:val="B09C02F2"/>
@@ -10183,7 +11175,7 @@
       </w:rPr>
     </w:lvl>
   </w:abstractNum>
-  <w:abstractNum w:abstractNumId="21" w15:restartNumberingAfterBreak="0">
+  <w:abstractNum w:abstractNumId="24" w15:restartNumberingAfterBreak="0">
     <w:nsid w:val="2D431C04"/>
     <w:multiLevelType w:val="multilevel"/>
     <w:tmpl w:val="0B8E8EE6"/>
@@ -10332,7 +11324,7 @@
       </w:rPr>
     </w:lvl>
   </w:abstractNum>
-  <w:abstractNum w:abstractNumId="22" w15:restartNumberingAfterBreak="0">
+  <w:abstractNum w:abstractNumId="25" w15:restartNumberingAfterBreak="0">
     <w:nsid w:val="2E6F066D"/>
     <w:multiLevelType w:val="multilevel"/>
     <w:tmpl w:val="6548ED6A"/>
@@ -10481,7 +11473,7 @@
       </w:rPr>
     </w:lvl>
   </w:abstractNum>
-  <w:abstractNum w:abstractNumId="23" w15:restartNumberingAfterBreak="0">
+  <w:abstractNum w:abstractNumId="26" w15:restartNumberingAfterBreak="0">
     <w:nsid w:val="2E715935"/>
     <w:multiLevelType w:val="multilevel"/>
     <w:tmpl w:val="1E980F2E"/>
@@ -10630,7 +11622,7 @@
       </w:rPr>
     </w:lvl>
   </w:abstractNum>
-  <w:abstractNum w:abstractNumId="24" w15:restartNumberingAfterBreak="0">
+  <w:abstractNum w:abstractNumId="27" w15:restartNumberingAfterBreak="0">
     <w:nsid w:val="30B0116D"/>
     <w:multiLevelType w:val="multilevel"/>
     <w:tmpl w:val="821AA752"/>
@@ -10779,7 +11771,7 @@
       </w:rPr>
     </w:lvl>
   </w:abstractNum>
-  <w:abstractNum w:abstractNumId="25" w15:restartNumberingAfterBreak="0">
+  <w:abstractNum w:abstractNumId="28" w15:restartNumberingAfterBreak="0">
     <w:nsid w:val="3109649C"/>
     <w:multiLevelType w:val="multilevel"/>
     <w:tmpl w:val="0D8C363E"/>
@@ -10892,7 +11884,7 @@
       </w:pPr>
     </w:lvl>
   </w:abstractNum>
-  <w:abstractNum w:abstractNumId="26" w15:restartNumberingAfterBreak="0">
+  <w:abstractNum w:abstractNumId="29" w15:restartNumberingAfterBreak="0">
     <w:nsid w:val="3C0554AC"/>
     <w:multiLevelType w:val="multilevel"/>
     <w:tmpl w:val="33C8EE3C"/>
@@ -11005,7 +11997,7 @@
       </w:rPr>
     </w:lvl>
   </w:abstractNum>
-  <w:abstractNum w:abstractNumId="27" w15:restartNumberingAfterBreak="0">
+  <w:abstractNum w:abstractNumId="30" w15:restartNumberingAfterBreak="0">
     <w:nsid w:val="3FCA6C35"/>
     <w:multiLevelType w:val="multilevel"/>
     <w:tmpl w:val="F364F25E"/>
@@ -11154,7 +12146,7 @@
       </w:rPr>
     </w:lvl>
   </w:abstractNum>
-  <w:abstractNum w:abstractNumId="28" w15:restartNumberingAfterBreak="0">
+  <w:abstractNum w:abstractNumId="31" w15:restartNumberingAfterBreak="0">
     <w:nsid w:val="44397DC8"/>
     <w:multiLevelType w:val="hybridMultilevel"/>
     <w:tmpl w:val="5B30D914"/>
@@ -11267,7 +12259,7 @@
       </w:rPr>
     </w:lvl>
   </w:abstractNum>
-  <w:abstractNum w:abstractNumId="29" w15:restartNumberingAfterBreak="0">
+  <w:abstractNum w:abstractNumId="32" w15:restartNumberingAfterBreak="0">
     <w:nsid w:val="488C5FA5"/>
     <w:multiLevelType w:val="multilevel"/>
     <w:tmpl w:val="04102514"/>
@@ -11416,7 +12408,7 @@
       </w:rPr>
     </w:lvl>
   </w:abstractNum>
-  <w:abstractNum w:abstractNumId="30" w15:restartNumberingAfterBreak="0">
+  <w:abstractNum w:abstractNumId="33" w15:restartNumberingAfterBreak="0">
     <w:nsid w:val="49701FB9"/>
     <w:multiLevelType w:val="multilevel"/>
     <w:tmpl w:val="7FA68A28"/>
@@ -11565,7 +12557,7 @@
       </w:rPr>
     </w:lvl>
   </w:abstractNum>
-  <w:abstractNum w:abstractNumId="31" w15:restartNumberingAfterBreak="0">
+  <w:abstractNum w:abstractNumId="34" w15:restartNumberingAfterBreak="0">
     <w:nsid w:val="4AFF4C94"/>
     <w:multiLevelType w:val="multilevel"/>
     <w:tmpl w:val="10387C4E"/>
@@ -11714,7 +12706,7 @@
       </w:rPr>
     </w:lvl>
   </w:abstractNum>
-  <w:abstractNum w:abstractNumId="32" w15:restartNumberingAfterBreak="0">
+  <w:abstractNum w:abstractNumId="35" w15:restartNumberingAfterBreak="0">
     <w:nsid w:val="51DD60E7"/>
     <w:multiLevelType w:val="multilevel"/>
     <w:tmpl w:val="79E00146"/>
@@ -11863,7 +12855,7 @@
       </w:rPr>
     </w:lvl>
   </w:abstractNum>
-  <w:abstractNum w:abstractNumId="33" w15:restartNumberingAfterBreak="0">
+  <w:abstractNum w:abstractNumId="36" w15:restartNumberingAfterBreak="0">
     <w:nsid w:val="52717091"/>
     <w:multiLevelType w:val="multilevel"/>
     <w:tmpl w:val="988A7B10"/>
@@ -11976,7 +12968,7 @@
       </w:pPr>
     </w:lvl>
   </w:abstractNum>
-  <w:abstractNum w:abstractNumId="34" w15:restartNumberingAfterBreak="0">
+  <w:abstractNum w:abstractNumId="37" w15:restartNumberingAfterBreak="0">
     <w:nsid w:val="53C152FF"/>
     <w:multiLevelType w:val="hybridMultilevel"/>
     <w:tmpl w:val="861A110C"/>
@@ -12089,7 +13081,7 @@
       </w:rPr>
     </w:lvl>
   </w:abstractNum>
-  <w:abstractNum w:abstractNumId="35" w15:restartNumberingAfterBreak="0">
+  <w:abstractNum w:abstractNumId="38" w15:restartNumberingAfterBreak="0">
     <w:nsid w:val="56CF1B97"/>
     <w:multiLevelType w:val="hybridMultilevel"/>
     <w:tmpl w:val="5E042A0A"/>
@@ -12202,7 +13194,7 @@
       </w:rPr>
     </w:lvl>
   </w:abstractNum>
-  <w:abstractNum w:abstractNumId="36" w15:restartNumberingAfterBreak="0">
+  <w:abstractNum w:abstractNumId="39" w15:restartNumberingAfterBreak="0">
     <w:nsid w:val="5F725F4E"/>
     <w:multiLevelType w:val="multilevel"/>
     <w:tmpl w:val="2092CE58"/>
@@ -12351,7 +13343,7 @@
       </w:rPr>
     </w:lvl>
   </w:abstractNum>
-  <w:abstractNum w:abstractNumId="37" w15:restartNumberingAfterBreak="0">
+  <w:abstractNum w:abstractNumId="40" w15:restartNumberingAfterBreak="0">
     <w:nsid w:val="5F8D6E8F"/>
     <w:multiLevelType w:val="hybridMultilevel"/>
     <w:tmpl w:val="7D56B80A"/>
@@ -12464,7 +13456,7 @@
       </w:rPr>
     </w:lvl>
   </w:abstractNum>
-  <w:abstractNum w:abstractNumId="38" w15:restartNumberingAfterBreak="0">
+  <w:abstractNum w:abstractNumId="41" w15:restartNumberingAfterBreak="0">
     <w:nsid w:val="611705C2"/>
     <w:multiLevelType w:val="multilevel"/>
     <w:tmpl w:val="32346F9A"/>
@@ -12613,7 +13605,7 @@
       </w:rPr>
     </w:lvl>
   </w:abstractNum>
-  <w:abstractNum w:abstractNumId="39" w15:restartNumberingAfterBreak="0">
+  <w:abstractNum w:abstractNumId="42" w15:restartNumberingAfterBreak="0">
     <w:nsid w:val="6A6A2A5E"/>
     <w:multiLevelType w:val="multilevel"/>
     <w:tmpl w:val="2262929C"/>
@@ -12762,7 +13754,7 @@
       </w:rPr>
     </w:lvl>
   </w:abstractNum>
-  <w:abstractNum w:abstractNumId="40" w15:restartNumberingAfterBreak="0">
+  <w:abstractNum w:abstractNumId="43" w15:restartNumberingAfterBreak="0">
     <w:nsid w:val="6A9E1020"/>
     <w:multiLevelType w:val="multilevel"/>
     <w:tmpl w:val="787ED8D0"/>
@@ -12911,7 +13903,7 @@
       </w:rPr>
     </w:lvl>
   </w:abstractNum>
-  <w:abstractNum w:abstractNumId="41" w15:restartNumberingAfterBreak="0">
+  <w:abstractNum w:abstractNumId="44" w15:restartNumberingAfterBreak="0">
     <w:nsid w:val="74EF39A5"/>
     <w:multiLevelType w:val="hybridMultilevel"/>
     <w:tmpl w:val="52A8843A"/>
@@ -13024,7 +14016,7 @@
       </w:rPr>
     </w:lvl>
   </w:abstractNum>
-  <w:abstractNum w:abstractNumId="42" w15:restartNumberingAfterBreak="0">
+  <w:abstractNum w:abstractNumId="45" w15:restartNumberingAfterBreak="0">
     <w:nsid w:val="7538491D"/>
     <w:multiLevelType w:val="multilevel"/>
     <w:tmpl w:val="45C05FD4"/>
@@ -13173,7 +14165,7 @@
       </w:rPr>
     </w:lvl>
   </w:abstractNum>
-  <w:abstractNum w:abstractNumId="43" w15:restartNumberingAfterBreak="0">
+  <w:abstractNum w:abstractNumId="46" w15:restartNumberingAfterBreak="0">
     <w:nsid w:val="7D201A14"/>
     <w:multiLevelType w:val="hybridMultilevel"/>
     <w:tmpl w:val="311A2460"/>
@@ -13286,7 +14278,7 @@
       </w:rPr>
     </w:lvl>
   </w:abstractNum>
-  <w:abstractNum w:abstractNumId="44" w15:restartNumberingAfterBreak="0">
+  <w:abstractNum w:abstractNumId="47" w15:restartNumberingAfterBreak="0">
     <w:nsid w:val="7EFD7FF8"/>
     <w:multiLevelType w:val="multilevel"/>
     <w:tmpl w:val="1D04A5AE"/>
@@ -13436,139 +14428,148 @@
     </w:lvl>
   </w:abstractNum>
   <w:num w:numId="1" w16cid:durableId="813066296">
-    <w:abstractNumId w:val="9"/>
+    <w:abstractNumId w:val="12"/>
   </w:num>
   <w:num w:numId="2" w16cid:durableId="1605846589">
-    <w:abstractNumId w:val="12"/>
+    <w:abstractNumId w:val="15"/>
   </w:num>
   <w:num w:numId="3" w16cid:durableId="1542670812">
     <w:abstractNumId w:val="0"/>
   </w:num>
   <w:num w:numId="4" w16cid:durableId="105009469">
+    <w:abstractNumId w:val="23"/>
+  </w:num>
+  <w:num w:numId="5" w16cid:durableId="1959794845">
+    <w:abstractNumId w:val="41"/>
+  </w:num>
+  <w:num w:numId="6" w16cid:durableId="1054306068">
+    <w:abstractNumId w:val="47"/>
+  </w:num>
+  <w:num w:numId="7" w16cid:durableId="75826173">
+    <w:abstractNumId w:val="19"/>
+  </w:num>
+  <w:num w:numId="8" w16cid:durableId="973488736">
+    <w:abstractNumId w:val="24"/>
+  </w:num>
+  <w:num w:numId="9" w16cid:durableId="894243252">
+    <w:abstractNumId w:val="22"/>
+  </w:num>
+  <w:num w:numId="10" w16cid:durableId="1581711934">
+    <w:abstractNumId w:val="39"/>
+  </w:num>
+  <w:num w:numId="11" w16cid:durableId="1053314773">
+    <w:abstractNumId w:val="27"/>
+  </w:num>
+  <w:num w:numId="12" w16cid:durableId="982082801">
+    <w:abstractNumId w:val="11"/>
+  </w:num>
+  <w:num w:numId="13" w16cid:durableId="1942642195">
+    <w:abstractNumId w:val="32"/>
+  </w:num>
+  <w:num w:numId="14" w16cid:durableId="1521892649">
+    <w:abstractNumId w:val="30"/>
+  </w:num>
+  <w:num w:numId="15" w16cid:durableId="471140940">
+    <w:abstractNumId w:val="13"/>
+  </w:num>
+  <w:num w:numId="16" w16cid:durableId="1053582004">
+    <w:abstractNumId w:val="25"/>
+  </w:num>
+  <w:num w:numId="17" w16cid:durableId="835223349">
+    <w:abstractNumId w:val="43"/>
+  </w:num>
+  <w:num w:numId="18" w16cid:durableId="1779255702">
+    <w:abstractNumId w:val="45"/>
+  </w:num>
+  <w:num w:numId="19" w16cid:durableId="1259371244">
+    <w:abstractNumId w:val="36"/>
+  </w:num>
+  <w:num w:numId="20" w16cid:durableId="1247959597">
+    <w:abstractNumId w:val="17"/>
+  </w:num>
+  <w:num w:numId="21" w16cid:durableId="623586829">
+    <w:abstractNumId w:val="28"/>
+  </w:num>
+  <w:num w:numId="22" w16cid:durableId="444547677">
+    <w:abstractNumId w:val="35"/>
+  </w:num>
+  <w:num w:numId="23" w16cid:durableId="1435632158">
+    <w:abstractNumId w:val="26"/>
+  </w:num>
+  <w:num w:numId="24" w16cid:durableId="1338846850">
+    <w:abstractNumId w:val="46"/>
+  </w:num>
+  <w:num w:numId="25" w16cid:durableId="513811019">
+    <w:abstractNumId w:val="31"/>
+  </w:num>
+  <w:num w:numId="26" w16cid:durableId="2108496299">
+    <w:abstractNumId w:val="42"/>
+  </w:num>
+  <w:num w:numId="27" w16cid:durableId="938222797">
+    <w:abstractNumId w:val="3"/>
+  </w:num>
+  <w:num w:numId="28" w16cid:durableId="743795105">
+    <w:abstractNumId w:val="6"/>
+  </w:num>
+  <w:num w:numId="29" w16cid:durableId="2037920253">
+    <w:abstractNumId w:val="29"/>
+  </w:num>
+  <w:num w:numId="30" w16cid:durableId="2061441317">
+    <w:abstractNumId w:val="21"/>
+  </w:num>
+  <w:num w:numId="31" w16cid:durableId="558830361">
+    <w:abstractNumId w:val="40"/>
+  </w:num>
+  <w:num w:numId="32" w16cid:durableId="2042048426">
+    <w:abstractNumId w:val="18"/>
+  </w:num>
+  <w:num w:numId="33" w16cid:durableId="291717604">
+    <w:abstractNumId w:val="8"/>
+  </w:num>
+  <w:num w:numId="34" w16cid:durableId="348530602">
+    <w:abstractNumId w:val="34"/>
+  </w:num>
+  <w:num w:numId="35" w16cid:durableId="223106676">
+    <w:abstractNumId w:val="38"/>
+  </w:num>
+  <w:num w:numId="36" w16cid:durableId="1212182648">
+    <w:abstractNumId w:val="5"/>
+  </w:num>
+  <w:num w:numId="37" w16cid:durableId="2094204862">
     <w:abstractNumId w:val="20"/>
   </w:num>
-  <w:num w:numId="5" w16cid:durableId="1959794845">
-    <w:abstractNumId w:val="38"/>
+  <w:num w:numId="38" w16cid:durableId="867450613">
+    <w:abstractNumId w:val="4"/>
   </w:num>
-  <w:num w:numId="6" w16cid:durableId="1054306068">
+  <w:num w:numId="39" w16cid:durableId="1263999416">
+    <w:abstractNumId w:val="33"/>
+  </w:num>
+  <w:num w:numId="40" w16cid:durableId="129056618">
     <w:abstractNumId w:val="44"/>
   </w:num>
-  <w:num w:numId="7" w16cid:durableId="75826173">
+  <w:num w:numId="41" w16cid:durableId="1062679952">
+    <w:abstractNumId w:val="14"/>
+  </w:num>
+  <w:num w:numId="42" w16cid:durableId="1076393173">
+    <w:abstractNumId w:val="37"/>
+  </w:num>
+  <w:num w:numId="43" w16cid:durableId="1803692851">
+    <w:abstractNumId w:val="7"/>
+  </w:num>
+  <w:num w:numId="44" w16cid:durableId="1892419007">
+    <w:abstractNumId w:val="9"/>
+  </w:num>
+  <w:num w:numId="45" w16cid:durableId="1101411171">
     <w:abstractNumId w:val="16"/>
   </w:num>
-  <w:num w:numId="8" w16cid:durableId="973488736">
-    <w:abstractNumId w:val="21"/>
-  </w:num>
-  <w:num w:numId="9" w16cid:durableId="894243252">
-    <w:abstractNumId w:val="19"/>
-  </w:num>
-  <w:num w:numId="10" w16cid:durableId="1581711934">
-    <w:abstractNumId w:val="36"/>
-  </w:num>
-  <w:num w:numId="11" w16cid:durableId="1053314773">
-    <w:abstractNumId w:val="24"/>
-  </w:num>
-  <w:num w:numId="12" w16cid:durableId="982082801">
-    <w:abstractNumId w:val="8"/>
-  </w:num>
-  <w:num w:numId="13" w16cid:durableId="1942642195">
-    <w:abstractNumId w:val="29"/>
-  </w:num>
-  <w:num w:numId="14" w16cid:durableId="1521892649">
-    <w:abstractNumId w:val="27"/>
-  </w:num>
-  <w:num w:numId="15" w16cid:durableId="471140940">
+  <w:num w:numId="46" w16cid:durableId="822815479">
     <w:abstractNumId w:val="10"/>
   </w:num>
-  <w:num w:numId="16" w16cid:durableId="1053582004">
-    <w:abstractNumId w:val="22"/>
-  </w:num>
-  <w:num w:numId="17" w16cid:durableId="835223349">
-    <w:abstractNumId w:val="40"/>
-  </w:num>
-  <w:num w:numId="18" w16cid:durableId="1779255702">
-    <w:abstractNumId w:val="42"/>
-  </w:num>
-  <w:num w:numId="19" w16cid:durableId="1259371244">
-    <w:abstractNumId w:val="33"/>
-  </w:num>
-  <w:num w:numId="20" w16cid:durableId="1247959597">
-    <w:abstractNumId w:val="14"/>
-  </w:num>
-  <w:num w:numId="21" w16cid:durableId="623586829">
-    <w:abstractNumId w:val="25"/>
-  </w:num>
-  <w:num w:numId="22" w16cid:durableId="444547677">
-    <w:abstractNumId w:val="32"/>
-  </w:num>
-  <w:num w:numId="23" w16cid:durableId="1435632158">
-    <w:abstractNumId w:val="23"/>
-  </w:num>
-  <w:num w:numId="24" w16cid:durableId="1338846850">
-    <w:abstractNumId w:val="43"/>
-  </w:num>
-  <w:num w:numId="25" w16cid:durableId="513811019">
-    <w:abstractNumId w:val="28"/>
-  </w:num>
-  <w:num w:numId="26" w16cid:durableId="2108496299">
-    <w:abstractNumId w:val="39"/>
-  </w:num>
-  <w:num w:numId="27" w16cid:durableId="938222797">
+  <w:num w:numId="47" w16cid:durableId="1552034066">
     <w:abstractNumId w:val="1"/>
   </w:num>
-  <w:num w:numId="28" w16cid:durableId="743795105">
-    <w:abstractNumId w:val="4"/>
-  </w:num>
-  <w:num w:numId="29" w16cid:durableId="2037920253">
-    <w:abstractNumId w:val="26"/>
-  </w:num>
-  <w:num w:numId="30" w16cid:durableId="2061441317">
-    <w:abstractNumId w:val="18"/>
-  </w:num>
-  <w:num w:numId="31" w16cid:durableId="558830361">
-    <w:abstractNumId w:val="37"/>
-  </w:num>
-  <w:num w:numId="32" w16cid:durableId="2042048426">
-    <w:abstractNumId w:val="15"/>
-  </w:num>
-  <w:num w:numId="33" w16cid:durableId="291717604">
-    <w:abstractNumId w:val="6"/>
-  </w:num>
-  <w:num w:numId="34" w16cid:durableId="348530602">
-    <w:abstractNumId w:val="31"/>
-  </w:num>
-  <w:num w:numId="35" w16cid:durableId="223106676">
-    <w:abstractNumId w:val="35"/>
-  </w:num>
-  <w:num w:numId="36" w16cid:durableId="1212182648">
-    <w:abstractNumId w:val="3"/>
-  </w:num>
-  <w:num w:numId="37" w16cid:durableId="2094204862">
-    <w:abstractNumId w:val="17"/>
-  </w:num>
-  <w:num w:numId="38" w16cid:durableId="867450613">
+  <w:num w:numId="48" w16cid:durableId="843394347">
     <w:abstractNumId w:val="2"/>
-  </w:num>
-  <w:num w:numId="39" w16cid:durableId="1263999416">
-    <w:abstractNumId w:val="30"/>
-  </w:num>
-  <w:num w:numId="40" w16cid:durableId="129056618">
-    <w:abstractNumId w:val="41"/>
-  </w:num>
-  <w:num w:numId="41" w16cid:durableId="1062679952">
-    <w:abstractNumId w:val="11"/>
-  </w:num>
-  <w:num w:numId="42" w16cid:durableId="1076393173">
-    <w:abstractNumId w:val="34"/>
-  </w:num>
-  <w:num w:numId="43" w16cid:durableId="1803692851">
-    <w:abstractNumId w:val="5"/>
-  </w:num>
-  <w:num w:numId="44" w16cid:durableId="1892419007">
-    <w:abstractNumId w:val="7"/>
-  </w:num>
-  <w:num w:numId="45" w16cid:durableId="1101411171">
-    <w:abstractNumId w:val="13"/>
   </w:num>
 </w:numbering>
 </file>
@@ -14518,6 +15519,25 @@
       </w:tblBorders>
     </w:tblPr>
   </w:style>
+  <w:style w:type="paragraph" w:styleId="Descripcin">
+    <w:name w:val="caption"/>
+    <w:basedOn w:val="Normal"/>
+    <w:next w:val="Normal"/>
+    <w:uiPriority w:val="35"/>
+    <w:unhideWhenUsed/>
+    <w:qFormat/>
+    <w:rsid w:val="0065433A"/>
+    <w:pPr>
+      <w:spacing w:after="200" w:line="240" w:lineRule="auto"/>
+    </w:pPr>
+    <w:rPr>
+      <w:i/>
+      <w:iCs/>
+      <w:color w:val="0E2841" w:themeColor="text2"/>
+      <w:sz w:val="18"/>
+      <w:szCs w:val="18"/>
+    </w:rPr>
+  </w:style>
 </w:styles>
 </file>
 
@@ -14834,4 +15854,16 @@
     </a:ext>
   </a:extLst>
 </a:theme>
+</file>
+
+<file path=customXml/item1.xml><?xml version="1.0" encoding="utf-8"?>
+<b:Sources xmlns:b="http://schemas.openxmlformats.org/officeDocument/2006/bibliography" xmlns="http://schemas.openxmlformats.org/officeDocument/2006/bibliography" SelectedStyle="\APASixthEditionOfficeOnline.xsl" StyleName="APA" Version="6"/>
+</file>
+
+<file path=customXml/itemProps1.xml><?xml version="1.0" encoding="utf-8"?>
+<ds:datastoreItem xmlns:ds="http://schemas.openxmlformats.org/officeDocument/2006/customXml" ds:itemID="{E16E1C0D-5439-4350-9A35-995F0FB47A10}">
+  <ds:schemaRefs>
+    <ds:schemaRef ds:uri="http://schemas.openxmlformats.org/officeDocument/2006/bibliography"/>
+  </ds:schemaRefs>
+</ds:datastoreItem>
 </file>
</xml_diff>

<commit_message>
Reemplaza OAuth externo por servicio de autenticación JWT interno
Actualiza RNF-02.1, la visión de negocio y el documento de la Fase 1.
Elimina la versión Markdown de la Fase 1; el .docx queda como fuente.
</commit_message>
<xml_diff>
--- a/API de planes de ahorro bancario.docx
+++ b/API de planes de ahorro bancario.docx
@@ -233,7 +233,7 @@
         <w:rPr>
           <w:rFonts w:ascii="Times New Roman" w:hAnsi="Times New Roman" w:cs="Times New Roman"/>
         </w:rPr>
-        <w:t xml:space="preserve"> bancario, el servicio de identidad y el servicio de notificaciones. Su responsabilidad se concentrará en la simulación, creación, configuración y seguimiento de los planes de ahorro, mientras que el </w:t>
+        <w:t xml:space="preserve"> bancario y el servicio de notificaciones; la autenticación la resolverá un servicio propio que emite tokens JWT. Su responsabilidad se concentrará en la simulación, creación, configuración y seguimiento de los planes de ahorro, mientras que el </w:t>
       </w:r>
       <w:r>
         <w:rPr>
@@ -1674,7 +1674,7 @@
         <w:rPr>
           <w:rFonts w:ascii="Times New Roman" w:hAnsi="Times New Roman" w:cs="Times New Roman"/>
         </w:rPr>
-        <w:t xml:space="preserve"> bancario, el servicio de identidad y el servicio de notificaciones, sin duplicar las responsabilidades de estos sistemas.</w:t>
+        <w:t xml:space="preserve"> bancario y el servicio de notificaciones, sin duplicar las responsabilidades de estos sistemas.</w:t>
       </w:r>
     </w:p>
     <w:p>
@@ -2432,7 +2432,7 @@
         <w:rPr>
           <w:rFonts w:ascii="Times New Roman" w:hAnsi="Times New Roman" w:cs="Times New Roman"/>
         </w:rPr>
-        <w:t xml:space="preserve"> bancario, el servicio de identidad, el proceso de cobros y el servicio de notificaciones, sin duplicar sus responsabilidades</w:t>
+        <w:t xml:space="preserve"> bancario, el proceso de cobros y el servicio de notificaciones, sin duplicar sus responsabilidades</w:t>
       </w:r>
       <w:r>
         <w:rPr>
@@ -2792,7 +2792,7 @@
               <w:rPr>
                 <w:rFonts w:ascii="Times New Roman" w:hAnsi="Times New Roman" w:cs="Times New Roman"/>
               </w:rPr>
-              <w:t>Servicio de identidad y acceso</w:t>
+              <w:t>Servicio de autenticación JWT</w:t>
             </w:r>
           </w:p>
         </w:tc>
@@ -2811,7 +2811,7 @@
               <w:rPr>
                 <w:rFonts w:ascii="Times New Roman" w:hAnsi="Times New Roman" w:cs="Times New Roman"/>
               </w:rPr>
-              <w:t>Autentica al cliente y controla los permisos de acceso a los recursos.</w:t>
+              <w:t>Autentica al cliente, emite tokens JWT y controla los permisos de acceso a los recursos.</w:t>
             </w:r>
           </w:p>
         </w:tc>
@@ -3890,7 +3890,7 @@
               <w:rPr>
                 <w:rFonts w:ascii="Times New Roman" w:hAnsi="Times New Roman" w:cs="Times New Roman"/>
               </w:rPr>
-              <w:t xml:space="preserve"> bancario, identidad, cobros y notificaciones.</w:t>
+              <w:t xml:space="preserve"> bancario, cobros y notificaciones.</w:t>
             </w:r>
           </w:p>
         </w:tc>
@@ -4549,7 +4549,7 @@
               <w:rPr>
                 <w:rFonts w:ascii="Times New Roman" w:hAnsi="Times New Roman" w:cs="Times New Roman"/>
               </w:rPr>
-              <w:t>Core bancario, identidad y acceso, crédito, notificaciones y analítica</w:t>
+              <w:t>Core bancario, crédito, notificaciones y analítica</w:t>
             </w:r>
           </w:p>
         </w:tc>
@@ -5002,7 +5002,7 @@
         <w:rPr>
           <w:rFonts w:ascii="Times New Roman" w:hAnsi="Times New Roman" w:cs="Times New Roman"/>
         </w:rPr>
-        <w:t xml:space="preserve"> bancario, el servicio de identidad y el servicio de notificaciones.</w:t>
+        <w:t xml:space="preserve"> bancario y el servicio de notificaciones.</w:t>
       </w:r>
     </w:p>
     <w:p>
@@ -5436,6 +5436,24 @@
           <w:rFonts w:ascii="Times New Roman" w:hAnsi="Times New Roman" w:cs="Times New Roman"/>
         </w:rPr>
         <w:t>Aplicar la pérdida de intereses cuando se cancele un plan bloqueado.</w:t>
+      </w:r>
+    </w:p>
+    <w:p>
+      <w:pPr>
+        <w:pStyle w:val="Prrafodelista"/>
+        <w:numPr>
+          <w:ilvl w:val="0"/>
+          <w:numId w:val="43"/>
+        </w:numPr>
+        <w:rPr>
+          <w:rFonts w:ascii="Times New Roman" w:hAnsi="Times New Roman" w:cs="Times New Roman"/>
+        </w:rPr>
+      </w:pPr>
+      <w:r>
+        <w:rPr>
+          <w:rFonts w:ascii="Times New Roman" w:hAnsi="Times New Roman" w:cs="Times New Roman"/>
+        </w:rPr>
+        <w:t>Autenticar al cliente y emitir tokens JWT de corta duración mediante un servicio de autenticación propio.</w:t>
       </w:r>
     </w:p>
     <w:p>
@@ -5704,48 +5722,6 @@
               <w:rPr>
                 <w:rFonts w:ascii="Times New Roman" w:hAnsi="Times New Roman" w:cs="Times New Roman"/>
               </w:rPr>
-              <w:t>Servicio de identidad y acceso</w:t>
-            </w:r>
-          </w:p>
-        </w:tc>
-        <w:tc>
-          <w:tcPr>
-            <w:tcW w:w="0" w:type="auto"/>
-            <w:hideMark/>
-          </w:tcPr>
-          <w:p>
-            <w:pPr>
-              <w:spacing w:after="160" w:line="278" w:lineRule="auto"/>
-              <w:rPr>
-                <w:rFonts w:ascii="Times New Roman" w:hAnsi="Times New Roman" w:cs="Times New Roman"/>
-              </w:rPr>
-            </w:pPr>
-            <w:r>
-              <w:rPr>
-                <w:rFonts w:ascii="Times New Roman" w:hAnsi="Times New Roman" w:cs="Times New Roman"/>
-              </w:rPr>
-              <w:t>Autenticar al cliente, emitir los tokens y proporcionar la información necesaria para autorizar las operaciones.</w:t>
-            </w:r>
-          </w:p>
-        </w:tc>
-      </w:tr>
-      <w:tr>
-        <w:tc>
-          <w:tcPr>
-            <w:tcW w:w="0" w:type="auto"/>
-            <w:hideMark/>
-          </w:tcPr>
-          <w:p>
-            <w:pPr>
-              <w:spacing w:after="160" w:line="278" w:lineRule="auto"/>
-              <w:rPr>
-                <w:rFonts w:ascii="Times New Roman" w:hAnsi="Times New Roman" w:cs="Times New Roman"/>
-              </w:rPr>
-            </w:pPr>
-            <w:r>
-              <w:rPr>
-                <w:rFonts w:ascii="Times New Roman" w:hAnsi="Times New Roman" w:cs="Times New Roman"/>
-              </w:rPr>
               <w:t>Core bancario</w:t>
             </w:r>
           </w:p>
@@ -6158,7 +6134,7 @@
               <w:rPr>
                 <w:rFonts w:ascii="Times New Roman" w:hAnsi="Times New Roman" w:cs="Times New Roman"/>
               </w:rPr>
-              <w:t>Se utilizarán REST, OpenAPI 3.1, JSON, OAuth 2.0 y formatos estandarizados para fechas, montos y errores.</w:t>
+              <w:t>Se utilizarán REST, OpenAPI 3.1, JSON, JWT y formatos estandarizados para fechas, montos y errores.</w:t>
             </w:r>
           </w:p>
         </w:tc>
@@ -6201,7 +6177,7 @@
               <w:rPr>
                 <w:rFonts w:ascii="Times New Roman" w:hAnsi="Times New Roman" w:cs="Times New Roman"/>
               </w:rPr>
-              <w:t>El acceso utilizará OAuth 2.0 y tokens JWT de corta duración. También se aplicarán permisos por rol, validación de titularidad, cifrado y auditoría inmutable de los movimientos.</w:t>
+              <w:t>El acceso utilizará tokens JWT firmados y de corta duración, emitidos por un servicio de autenticación interno. También se aplicarán permisos por rol, validación de titularidad, cifrado y auditoría inmutable de los movimientos.</w:t>
             </w:r>
           </w:p>
         </w:tc>
@@ -6563,7 +6539,7 @@
         <w:rPr>
           <w:rFonts w:ascii="Times New Roman" w:hAnsi="Times New Roman" w:cs="Times New Roman"/>
         </w:rPr>
-        <w:t>Las solicitudes son recibidas por el API Gateway, que controla el acceso y dirige las operaciones hacia el servicio de planes de ahorro. La simulación podrá ejecutarse sin autenticación, bajo las restricciones correspondientes, mientras que la creación y administración de planes requerirán la validación del cliente mediante el servicio institucional de identidad y acceso.</w:t>
+        <w:t>Las solicitudes son recibidas por el API Gateway, que controla el acceso y dirige las operaciones hacia el servicio de planes de ahorro. La simulación podrá ejecutarse sin autenticación, bajo las restricciones correspondientes, mientras que la creación y administración de planes requerirán la validación del token JWT emitido por el servicio de autenticación interno.</w:t>
       </w:r>
     </w:p>
     <w:p>
@@ -6846,7 +6822,7 @@
         <w:rPr>
           <w:rFonts w:ascii="Times New Roman" w:hAnsi="Times New Roman" w:cs="Times New Roman"/>
         </w:rPr>
-        <w:t xml:space="preserve">La infraestructura reutilizará los servicios existentes de identidad, </w:t>
+        <w:t xml:space="preserve">La infraestructura reutilizará los servicios existentes de </w:t>
       </w:r>
       <w:r>
         <w:rPr>
@@ -6858,7 +6834,7 @@
         <w:rPr>
           <w:rFonts w:ascii="Times New Roman" w:hAnsi="Times New Roman" w:cs="Times New Roman"/>
         </w:rPr>
-        <w:t xml:space="preserve"> bancario y notificaciones. Por tanto, el nuevo despliegue se concentrará en la API, el trabajador de débitos y el almacenamiento correspondiente al dominio de planes de ahorro.</w:t>
+        <w:t xml:space="preserve"> bancario y notificaciones. Por tanto, el nuevo despliegue se concentrará en la API, el servicio de autenticación, el trabajador de débitos y el almacenamiento correspondiente al dominio de planes de ahorro.</w:t>
       </w:r>
     </w:p>
     <w:p>
@@ -7261,7 +7237,7 @@
               <w:rPr>
                 <w:rFonts w:ascii="Times New Roman" w:hAnsi="Times New Roman" w:cs="Times New Roman"/>
               </w:rPr>
-              <w:t>La operación de los planes depende de la disponibilidad del Core bancario y del servicio institucional de identidad y acceso.</w:t>
+              <w:t>La operación de los planes depende de la disponibilidad del Core bancario.</w:t>
             </w:r>
           </w:p>
         </w:tc>
@@ -8075,7 +8051,7 @@
           <w:rFonts w:ascii="Times New Roman" w:hAnsi="Times New Roman" w:cs="Times New Roman"/>
           <w:lang w:val="de-DE"/>
         </w:rPr>
-        <w:t xml:space="preserve">Hardt, D. (2012). </w:t>
+        <w:t xml:space="preserve">Jones, M., Bradley, J., &amp; Sakimura, N. (2015). </w:t>
       </w:r>
       <w:r>
         <w:rPr>
@@ -8084,14 +8060,14 @@
           <w:iCs/>
           <w:lang w:val="de-DE"/>
         </w:rPr>
-        <w:t>The OAuth 2.0 Authorization Framework</w:t>
+        <w:t>JSON Web Token (JWT)</w:t>
       </w:r>
       <w:r>
         <w:rPr>
           <w:rFonts w:ascii="Times New Roman" w:hAnsi="Times New Roman" w:cs="Times New Roman"/>
           <w:lang w:val="de-DE"/>
         </w:rPr>
-        <w:t>. RFC 6749. Internet Engineering Task Force.</w:t>
+        <w:t>. RFC 7519. Internet Engineering Task Force.</w:t>
       </w:r>
     </w:p>
     <w:p>

</xml_diff>